<commit_message>
Actualización documentación - AD, usuarios y avances DHCP
</commit_message>
<xml_diff>
--- a/Documentación_Proyecto Redes I.docx
+++ b/Documentación_Proyecto Redes I.docx
@@ -387,7 +387,7 @@
         <w:rPr/>
         <w:sectPr>
           <w:pgSz w:h="15840" w:w="12240" w:orient="portrait"/>
-          <w:pgMar w:bottom="1440.0000000000002" w:top="1440.0000000000002" w:left="1440.0000000000002" w:right="1440.0000000000002" w:header="720" w:footer="720"/>
+          <w:pgMar w:bottom="1440" w:top="1440" w:left="1440" w:right="1440" w:header="720" w:footer="720"/>
           <w:pgNumType w:start="1"/>
         </w:sectPr>
       </w:pPr>
@@ -3950,10 +3950,4276 @@
         </w:rPr>
       </w:r>
     </w:p>
+    <w:p>
+      <w:r>
+        <w:br w:type="page"/>
+      </w:r>
+    </w:p>
+    <w:p>
+      <w:pPr>
+        <w:keepNext/>
+        <w:spacing w:line="480" w:lineRule="auto" w:before="240" w:after="80"/>
+        <w:ind w:firstLine="0"/>
+        <w:jc w:val="center"/>
+      </w:pPr>
+      <w:r>
+        <w:rPr>
+          <w:rFonts w:ascii="Times New Roman" w:hAnsi="Times New Roman" w:eastAsia="Times New Roman"/>
+          <w:b/>
+          <w:sz w:val="24"/>
+        </w:rPr>
+        <w:t>Actualización de avances técnicos del proyecto</w:t>
+      </w:r>
+    </w:p>
+    <w:p>
+      <w:pPr>
+        <w:spacing w:line="480" w:lineRule="auto" w:before="0" w:after="160"/>
+        <w:ind w:firstLine="0"/>
+        <w:jc w:val="center"/>
+      </w:pPr>
+      <w:r>
+        <w:rPr>
+          <w:rFonts w:ascii="Times New Roman" w:hAnsi="Times New Roman" w:eastAsia="Times New Roman"/>
+          <w:i/>
+          <w:sz w:val="24"/>
+        </w:rPr>
+        <w:t>Avances incorporados al 21 de octubre de 2026</w:t>
+      </w:r>
+    </w:p>
+    <w:p>
+      <w:pPr>
+        <w:spacing w:line="480" w:lineRule="auto" w:before="0" w:after="0"/>
+        <w:ind w:firstLine="720"/>
+        <w:jc w:val="left"/>
+      </w:pPr>
+      <w:r>
+        <w:rPr>
+          <w:rFonts w:ascii="Times New Roman" w:hAnsi="Times New Roman" w:eastAsia="Times New Roman"/>
+          <w:sz w:val="24"/>
+        </w:rPr>
+        <w:t>Las páginas anteriores se conservan íntegramente como documentación de la etapa inicial del proyecto. La presente actualización no sustituye ni elimina esa información; registra la evolución posterior de la topología, la migración de los clientes Alpine a Debian, la implementación del controlador de dominio, las pruebas de autenticación y el avance actual del servicio DHCP.</w:t>
+      </w:r>
+    </w:p>
+    <w:p>
+      <w:pPr>
+        <w:keepNext/>
+        <w:spacing w:line="480" w:lineRule="auto" w:before="160" w:after="80"/>
+        <w:ind w:firstLine="0"/>
+        <w:jc w:val="left"/>
+      </w:pPr>
+      <w:r>
+        <w:rPr>
+          <w:rFonts w:ascii="Times New Roman" w:hAnsi="Times New Roman" w:eastAsia="Times New Roman"/>
+          <w:b/>
+          <w:sz w:val="24"/>
+        </w:rPr>
+        <w:t>1. Evolución de la topología</w:t>
+      </w:r>
+    </w:p>
+    <w:p>
+      <w:pPr>
+        <w:spacing w:line="480" w:lineRule="auto" w:before="0" w:after="0"/>
+        <w:ind w:firstLine="720"/>
+        <w:jc w:val="left"/>
+      </w:pPr>
+      <w:r>
+        <w:rPr>
+          <w:rFonts w:ascii="Times New Roman" w:hAnsi="Times New Roman" w:eastAsia="Times New Roman"/>
+          <w:sz w:val="24"/>
+        </w:rPr>
+        <w:t>La topología base documentada inicialmente se mantuvo en su estructura de tres segmentos IPv4, pero los dos clientes Alpine Linux fueron sustituidos por máquinas Debian 13 con entorno gráfico XFCE. La red de clientes continúa siendo 192.168.1.0/24, el enlace punto a punto entre R1 y R2 utiliza 192.168.2.0/30 y la LAN de servidores utiliza 192.168.3.0/24. R1 conserva la salida centralizada a Internet mediante NAT1 y R2 mantiene la interconexión hacia el servidor Debian.</w:t>
+      </w:r>
+    </w:p>
+    <w:p>
+      <w:pPr>
+        <w:keepNext/>
+        <w:spacing w:line="240" w:lineRule="auto" w:before="120" w:after="0"/>
+        <w:ind w:firstLine="0"/>
+        <w:jc w:val="left"/>
+      </w:pPr>
+      <w:r>
+        <w:rPr>
+          <w:rFonts w:ascii="Times New Roman" w:hAnsi="Times New Roman" w:eastAsia="Times New Roman"/>
+          <w:b/>
+          <w:sz w:val="24"/>
+        </w:rPr>
+        <w:t>Figura 1</w:t>
+      </w:r>
+    </w:p>
+    <w:p>
+      <w:pPr>
+        <w:keepNext/>
+        <w:spacing w:line="240" w:lineRule="auto" w:before="0" w:after="80"/>
+        <w:ind w:firstLine="0"/>
+        <w:jc w:val="left"/>
+      </w:pPr>
+      <w:r>
+        <w:rPr>
+          <w:rFonts w:ascii="Times New Roman" w:hAnsi="Times New Roman" w:eastAsia="Times New Roman"/>
+          <w:i/>
+          <w:sz w:val="24"/>
+        </w:rPr>
+        <w:t>Topología actual del proyecto en GNS3.</w:t>
+      </w:r>
+    </w:p>
+    <w:p>
+      <w:pPr>
+        <w:keepNext/>
+        <w:jc w:val="center"/>
+      </w:pPr>
+      <w:r>
+        <w:drawing>
+          <wp:inline>
+            <wp:extent cx="5760720" cy="2956609"/>
+            <wp:docPr id="14" name="Picture 14"/>
+            <wp:cNvGraphicFramePr>
+              <a:graphicFrameLocks noChangeAspect="1"/>
+            </wp:cNvGraphicFramePr>
+            <a:graphic>
+              <a:graphicData uri="http://schemas.openxmlformats.org/drawingml/2006/picture">
+                <pic:pic>
+                  <pic:nvPicPr>
+                    <pic:cNvPr id="0" name="image(20261022-040751).png"/>
+                    <pic:cNvPicPr/>
+                  </pic:nvPicPr>
+                  <pic:blipFill>
+                    <a:blip r:embed="rId19"/>
+                    <a:stretch>
+                      <a:fillRect/>
+                    </a:stretch>
+                  </pic:blipFill>
+                  <pic:spPr>
+                    <a:xfrm>
+                      <a:off x="0" y="0"/>
+                      <a:ext cx="5760720" cy="2956609"/>
+                    </a:xfrm>
+                    <a:prstGeom prst="rect"/>
+                  </pic:spPr>
+                </pic:pic>
+              </a:graphicData>
+            </a:graphic>
+          </wp:inline>
+        </w:drawing>
+      </w:r>
+    </w:p>
+    <w:p>
+      <w:pPr>
+        <w:spacing w:line="240" w:lineRule="auto" w:before="40" w:after="120"/>
+        <w:ind w:firstLine="0"/>
+        <w:jc w:val="left"/>
+      </w:pPr>
+      <w:r>
+        <w:rPr>
+          <w:rFonts w:ascii="Times New Roman" w:hAnsi="Times New Roman" w:eastAsia="Times New Roman"/>
+          <w:i/>
+          <w:sz w:val="20"/>
+        </w:rPr>
+        <w:t xml:space="preserve">Nota. </w:t>
+      </w:r>
+      <w:r>
+        <w:rPr>
+          <w:rFonts w:ascii="Times New Roman" w:hAnsi="Times New Roman" w:eastAsia="Times New Roman"/>
+          <w:sz w:val="20"/>
+        </w:rPr>
+        <w:t>Se observan DebianClient1 y DebianClient2 en la LAN 192.168.1.0/24, R1 y R2 unidos por 192.168.2.0/30, ServerDebian-1 en 192.168.3.0/24 y NAT1 conectado únicamente a R1.</w:t>
+      </w:r>
+    </w:p>
+    <w:p>
+      <w:pPr>
+        <w:keepNext/>
+        <w:spacing w:line="480" w:lineRule="auto" w:before="160" w:after="80"/>
+        <w:ind w:firstLine="0"/>
+        <w:jc w:val="left"/>
+      </w:pPr>
+      <w:r>
+        <w:rPr>
+          <w:rFonts w:ascii="Times New Roman" w:hAnsi="Times New Roman" w:eastAsia="Times New Roman"/>
+          <w:b/>
+          <w:sz w:val="24"/>
+        </w:rPr>
+        <w:t>1.1 Plan de direccionamiento actual</w:t>
+      </w:r>
+    </w:p>
+    <w:tbl>
+      <w:tblPr>
+        <w:tblW w:type="auto" w:w="0"/>
+        <w:jc w:val="center"/>
+        <w:tblLook w:firstColumn="1" w:firstRow="1" w:lastColumn="0" w:lastRow="0" w:noHBand="0" w:noVBand="1" w:val="04A0"/>
+        <w:tblBorders>
+          <w:top w:val="single" w:sz="4" w:space="0" w:color="000000"/>
+          <w:left w:val="single" w:sz="4" w:space="0" w:color="000000"/>
+          <w:bottom w:val="single" w:sz="4" w:space="0" w:color="000000"/>
+          <w:right w:val="single" w:sz="4" w:space="0" w:color="000000"/>
+          <w:insideH w:val="single" w:sz="4" w:space="0" w:color="000000"/>
+          <w:insideV w:val="single" w:sz="4" w:space="0" w:color="000000"/>
+        </w:tblBorders>
+      </w:tblPr>
+      <w:tblGrid>
+        <w:gridCol w:w="2340"/>
+        <w:gridCol w:w="2340"/>
+        <w:gridCol w:w="2340"/>
+        <w:gridCol w:w="2340"/>
+      </w:tblGrid>
+      <w:tr>
+        <w:tc>
+          <w:tcPr>
+            <w:tcW w:type="dxa" w:w="1800"/>
+            <w:vAlign w:val="center"/>
+            <w:shd w:fill="B4C6E7"/>
+          </w:tcPr>
+          <w:p>
+            <w:pPr>
+              <w:spacing w:before="0" w:after="0" w:line="240" w:lineRule="auto"/>
+              <w:jc w:val="center"/>
+            </w:pPr>
+            <w:r/>
+            <w:r>
+              <w:rPr>
+                <w:rFonts w:ascii="Times New Roman" w:hAnsi="Times New Roman" w:eastAsia="Times New Roman"/>
+                <w:b/>
+                <w:sz w:val="20"/>
+              </w:rPr>
+              <w:t>Dispositivo</w:t>
+            </w:r>
+          </w:p>
+        </w:tc>
+        <w:tc>
+          <w:tcPr>
+            <w:tcW w:type="dxa" w:w="2448"/>
+            <w:vAlign w:val="center"/>
+            <w:shd w:fill="B4C6E7"/>
+          </w:tcPr>
+          <w:p>
+            <w:pPr>
+              <w:spacing w:before="0" w:after="0" w:line="240" w:lineRule="auto"/>
+              <w:jc w:val="center"/>
+            </w:pPr>
+            <w:r/>
+            <w:r>
+              <w:rPr>
+                <w:rFonts w:ascii="Times New Roman" w:hAnsi="Times New Roman" w:eastAsia="Times New Roman"/>
+                <w:b/>
+                <w:sz w:val="20"/>
+              </w:rPr>
+              <w:t>Interfaz / función</w:t>
+            </w:r>
+          </w:p>
+        </w:tc>
+        <w:tc>
+          <w:tcPr>
+            <w:tcW w:type="dxa" w:w="1944"/>
+            <w:vAlign w:val="center"/>
+            <w:shd w:fill="B4C6E7"/>
+          </w:tcPr>
+          <w:p>
+            <w:pPr>
+              <w:spacing w:before="0" w:after="0" w:line="240" w:lineRule="auto"/>
+              <w:jc w:val="center"/>
+            </w:pPr>
+            <w:r/>
+            <w:r>
+              <w:rPr>
+                <w:rFonts w:ascii="Times New Roman" w:hAnsi="Times New Roman" w:eastAsia="Times New Roman"/>
+                <w:b/>
+                <w:sz w:val="20"/>
+              </w:rPr>
+              <w:t>Dirección IP</w:t>
+            </w:r>
+          </w:p>
+        </w:tc>
+        <w:tc>
+          <w:tcPr>
+            <w:tcW w:type="dxa" w:w="2448"/>
+            <w:vAlign w:val="center"/>
+            <w:shd w:fill="B4C6E7"/>
+          </w:tcPr>
+          <w:p>
+            <w:pPr>
+              <w:spacing w:before="0" w:after="0" w:line="240" w:lineRule="auto"/>
+              <w:jc w:val="center"/>
+            </w:pPr>
+            <w:r/>
+            <w:r>
+              <w:rPr>
+                <w:rFonts w:ascii="Times New Roman" w:hAnsi="Times New Roman" w:eastAsia="Times New Roman"/>
+                <w:b/>
+                <w:sz w:val="20"/>
+              </w:rPr>
+              <w:t>Gateway / siguiente salto</w:t>
+            </w:r>
+          </w:p>
+        </w:tc>
+      </w:tr>
+      <w:tr>
+        <w:tc>
+          <w:tcPr>
+            <w:tcW w:type="dxa" w:w="1800"/>
+            <w:vAlign w:val="center"/>
+          </w:tcPr>
+          <w:p>
+            <w:pPr>
+              <w:spacing w:before="0" w:after="0" w:line="240" w:lineRule="auto"/>
+              <w:jc w:val="left"/>
+            </w:pPr>
+            <w:r/>
+            <w:r>
+              <w:rPr>
+                <w:rFonts w:ascii="Times New Roman" w:hAnsi="Times New Roman" w:eastAsia="Times New Roman"/>
+                <w:b w:val="0"/>
+                <w:sz w:val="20"/>
+              </w:rPr>
+              <w:t>GNS3 VM</w:t>
+            </w:r>
+          </w:p>
+        </w:tc>
+        <w:tc>
+          <w:tcPr>
+            <w:tcW w:type="dxa" w:w="2448"/>
+            <w:vAlign w:val="center"/>
+          </w:tcPr>
+          <w:p>
+            <w:pPr>
+              <w:spacing w:before="0" w:after="0" w:line="240" w:lineRule="auto"/>
+              <w:jc w:val="left"/>
+            </w:pPr>
+            <w:r/>
+            <w:r>
+              <w:rPr>
+                <w:rFonts w:ascii="Times New Roman" w:hAnsi="Times New Roman" w:eastAsia="Times New Roman"/>
+                <w:b w:val="0"/>
+                <w:sz w:val="20"/>
+              </w:rPr>
+              <w:t>Administración</w:t>
+            </w:r>
+          </w:p>
+        </w:tc>
+        <w:tc>
+          <w:tcPr>
+            <w:tcW w:type="dxa" w:w="1944"/>
+            <w:vAlign w:val="center"/>
+          </w:tcPr>
+          <w:p>
+            <w:pPr>
+              <w:spacing w:before="0" w:after="0" w:line="240" w:lineRule="auto"/>
+              <w:jc w:val="left"/>
+            </w:pPr>
+            <w:r/>
+            <w:r>
+              <w:rPr>
+                <w:rFonts w:ascii="Times New Roman" w:hAnsi="Times New Roman" w:eastAsia="Times New Roman"/>
+                <w:b w:val="0"/>
+                <w:sz w:val="20"/>
+              </w:rPr>
+              <w:t>192.168.56.102</w:t>
+            </w:r>
+          </w:p>
+        </w:tc>
+        <w:tc>
+          <w:tcPr>
+            <w:tcW w:type="dxa" w:w="2448"/>
+            <w:vAlign w:val="center"/>
+          </w:tcPr>
+          <w:p>
+            <w:pPr>
+              <w:spacing w:before="0" w:after="0" w:line="240" w:lineRule="auto"/>
+              <w:jc w:val="left"/>
+            </w:pPr>
+            <w:r/>
+            <w:r>
+              <w:rPr>
+                <w:rFonts w:ascii="Times New Roman" w:hAnsi="Times New Roman" w:eastAsia="Times New Roman"/>
+                <w:b w:val="0"/>
+                <w:sz w:val="20"/>
+              </w:rPr>
+              <w:t>Red host-only</w:t>
+            </w:r>
+          </w:p>
+        </w:tc>
+      </w:tr>
+      <w:tr>
+        <w:tc>
+          <w:tcPr>
+            <w:tcW w:type="dxa" w:w="1800"/>
+            <w:vAlign w:val="center"/>
+          </w:tcPr>
+          <w:p>
+            <w:pPr>
+              <w:spacing w:before="0" w:after="0" w:line="240" w:lineRule="auto"/>
+              <w:jc w:val="left"/>
+            </w:pPr>
+            <w:r/>
+            <w:r>
+              <w:rPr>
+                <w:rFonts w:ascii="Times New Roman" w:hAnsi="Times New Roman" w:eastAsia="Times New Roman"/>
+                <w:b w:val="0"/>
+                <w:sz w:val="20"/>
+              </w:rPr>
+              <w:t>NAT1</w:t>
+            </w:r>
+          </w:p>
+        </w:tc>
+        <w:tc>
+          <w:tcPr>
+            <w:tcW w:type="dxa" w:w="2448"/>
+            <w:vAlign w:val="center"/>
+          </w:tcPr>
+          <w:p>
+            <w:pPr>
+              <w:spacing w:before="0" w:after="0" w:line="240" w:lineRule="auto"/>
+              <w:jc w:val="left"/>
+            </w:pPr>
+            <w:r/>
+            <w:r>
+              <w:rPr>
+                <w:rFonts w:ascii="Times New Roman" w:hAnsi="Times New Roman" w:eastAsia="Times New Roman"/>
+                <w:b w:val="0"/>
+                <w:sz w:val="20"/>
+              </w:rPr>
+              <w:t>Gateway NAT</w:t>
+            </w:r>
+          </w:p>
+        </w:tc>
+        <w:tc>
+          <w:tcPr>
+            <w:tcW w:type="dxa" w:w="1944"/>
+            <w:vAlign w:val="center"/>
+          </w:tcPr>
+          <w:p>
+            <w:pPr>
+              <w:spacing w:before="0" w:after="0" w:line="240" w:lineRule="auto"/>
+              <w:jc w:val="left"/>
+            </w:pPr>
+            <w:r/>
+            <w:r>
+              <w:rPr>
+                <w:rFonts w:ascii="Times New Roman" w:hAnsi="Times New Roman" w:eastAsia="Times New Roman"/>
+                <w:b w:val="0"/>
+                <w:sz w:val="20"/>
+              </w:rPr>
+              <w:t>192.168.122.1/24</w:t>
+            </w:r>
+          </w:p>
+        </w:tc>
+        <w:tc>
+          <w:tcPr>
+            <w:tcW w:type="dxa" w:w="2448"/>
+            <w:vAlign w:val="center"/>
+          </w:tcPr>
+          <w:p>
+            <w:pPr>
+              <w:spacing w:before="0" w:after="0" w:line="240" w:lineRule="auto"/>
+              <w:jc w:val="left"/>
+            </w:pPr>
+            <w:r/>
+            <w:r>
+              <w:rPr>
+                <w:rFonts w:ascii="Times New Roman" w:hAnsi="Times New Roman" w:eastAsia="Times New Roman"/>
+                <w:b w:val="0"/>
+                <w:sz w:val="20"/>
+              </w:rPr>
+              <w:t>Salida a Internet</w:t>
+            </w:r>
+          </w:p>
+        </w:tc>
+      </w:tr>
+      <w:tr>
+        <w:tc>
+          <w:tcPr>
+            <w:tcW w:type="dxa" w:w="1800"/>
+            <w:vAlign w:val="center"/>
+          </w:tcPr>
+          <w:p>
+            <w:pPr>
+              <w:spacing w:before="0" w:after="0" w:line="240" w:lineRule="auto"/>
+              <w:jc w:val="left"/>
+            </w:pPr>
+            <w:r/>
+            <w:r>
+              <w:rPr>
+                <w:rFonts w:ascii="Times New Roman" w:hAnsi="Times New Roman" w:eastAsia="Times New Roman"/>
+                <w:b w:val="0"/>
+                <w:sz w:val="20"/>
+              </w:rPr>
+              <w:t>R1</w:t>
+            </w:r>
+          </w:p>
+        </w:tc>
+        <w:tc>
+          <w:tcPr>
+            <w:tcW w:type="dxa" w:w="2448"/>
+            <w:vAlign w:val="center"/>
+          </w:tcPr>
+          <w:p>
+            <w:pPr>
+              <w:spacing w:before="0" w:after="0" w:line="240" w:lineRule="auto"/>
+              <w:jc w:val="left"/>
+            </w:pPr>
+            <w:r/>
+            <w:r>
+              <w:rPr>
+                <w:rFonts w:ascii="Times New Roman" w:hAnsi="Times New Roman" w:eastAsia="Times New Roman"/>
+                <w:b w:val="0"/>
+                <w:sz w:val="20"/>
+              </w:rPr>
+              <w:t>Fa0/0 – LAN clientes</w:t>
+            </w:r>
+          </w:p>
+        </w:tc>
+        <w:tc>
+          <w:tcPr>
+            <w:tcW w:type="dxa" w:w="1944"/>
+            <w:vAlign w:val="center"/>
+          </w:tcPr>
+          <w:p>
+            <w:pPr>
+              <w:spacing w:before="0" w:after="0" w:line="240" w:lineRule="auto"/>
+              <w:jc w:val="left"/>
+            </w:pPr>
+            <w:r/>
+            <w:r>
+              <w:rPr>
+                <w:rFonts w:ascii="Times New Roman" w:hAnsi="Times New Roman" w:eastAsia="Times New Roman"/>
+                <w:b w:val="0"/>
+                <w:sz w:val="20"/>
+              </w:rPr>
+              <w:t>192.168.1.1/24</w:t>
+            </w:r>
+          </w:p>
+        </w:tc>
+        <w:tc>
+          <w:tcPr>
+            <w:tcW w:type="dxa" w:w="2448"/>
+            <w:vAlign w:val="center"/>
+          </w:tcPr>
+          <w:p>
+            <w:pPr>
+              <w:spacing w:before="0" w:after="0" w:line="240" w:lineRule="auto"/>
+              <w:jc w:val="left"/>
+            </w:pPr>
+            <w:r/>
+            <w:r>
+              <w:rPr>
+                <w:rFonts w:ascii="Times New Roman" w:hAnsi="Times New Roman" w:eastAsia="Times New Roman"/>
+                <w:b w:val="0"/>
+                <w:sz w:val="20"/>
+              </w:rPr>
+              <w:t>—</w:t>
+            </w:r>
+          </w:p>
+        </w:tc>
+      </w:tr>
+      <w:tr>
+        <w:tc>
+          <w:tcPr>
+            <w:tcW w:type="dxa" w:w="1800"/>
+            <w:vAlign w:val="center"/>
+          </w:tcPr>
+          <w:p>
+            <w:pPr>
+              <w:spacing w:before="0" w:after="0" w:line="240" w:lineRule="auto"/>
+              <w:jc w:val="left"/>
+            </w:pPr>
+            <w:r/>
+            <w:r>
+              <w:rPr>
+                <w:rFonts w:ascii="Times New Roman" w:hAnsi="Times New Roman" w:eastAsia="Times New Roman"/>
+                <w:b w:val="0"/>
+                <w:sz w:val="20"/>
+              </w:rPr>
+              <w:t>R1</w:t>
+            </w:r>
+          </w:p>
+        </w:tc>
+        <w:tc>
+          <w:tcPr>
+            <w:tcW w:type="dxa" w:w="2448"/>
+            <w:vAlign w:val="center"/>
+          </w:tcPr>
+          <w:p>
+            <w:pPr>
+              <w:spacing w:before="0" w:after="0" w:line="240" w:lineRule="auto"/>
+              <w:jc w:val="left"/>
+            </w:pPr>
+            <w:r/>
+            <w:r>
+              <w:rPr>
+                <w:rFonts w:ascii="Times New Roman" w:hAnsi="Times New Roman" w:eastAsia="Times New Roman"/>
+                <w:b w:val="0"/>
+                <w:sz w:val="20"/>
+              </w:rPr>
+              <w:t>Fa0/1 – enlace R2</w:t>
+            </w:r>
+          </w:p>
+        </w:tc>
+        <w:tc>
+          <w:tcPr>
+            <w:tcW w:type="dxa" w:w="1944"/>
+            <w:vAlign w:val="center"/>
+          </w:tcPr>
+          <w:p>
+            <w:pPr>
+              <w:spacing w:before="0" w:after="0" w:line="240" w:lineRule="auto"/>
+              <w:jc w:val="left"/>
+            </w:pPr>
+            <w:r/>
+            <w:r>
+              <w:rPr>
+                <w:rFonts w:ascii="Times New Roman" w:hAnsi="Times New Roman" w:eastAsia="Times New Roman"/>
+                <w:b w:val="0"/>
+                <w:sz w:val="20"/>
+              </w:rPr>
+              <w:t>192.168.2.1/30</w:t>
+            </w:r>
+          </w:p>
+        </w:tc>
+        <w:tc>
+          <w:tcPr>
+            <w:tcW w:type="dxa" w:w="2448"/>
+            <w:vAlign w:val="center"/>
+          </w:tcPr>
+          <w:p>
+            <w:pPr>
+              <w:spacing w:before="0" w:after="0" w:line="240" w:lineRule="auto"/>
+              <w:jc w:val="left"/>
+            </w:pPr>
+            <w:r/>
+            <w:r>
+              <w:rPr>
+                <w:rFonts w:ascii="Times New Roman" w:hAnsi="Times New Roman" w:eastAsia="Times New Roman"/>
+                <w:b w:val="0"/>
+                <w:sz w:val="20"/>
+              </w:rPr>
+              <w:t>—</w:t>
+            </w:r>
+          </w:p>
+        </w:tc>
+      </w:tr>
+      <w:tr>
+        <w:tc>
+          <w:tcPr>
+            <w:tcW w:type="dxa" w:w="1800"/>
+            <w:vAlign w:val="center"/>
+          </w:tcPr>
+          <w:p>
+            <w:pPr>
+              <w:spacing w:before="0" w:after="0" w:line="240" w:lineRule="auto"/>
+              <w:jc w:val="left"/>
+            </w:pPr>
+            <w:r/>
+            <w:r>
+              <w:rPr>
+                <w:rFonts w:ascii="Times New Roman" w:hAnsi="Times New Roman" w:eastAsia="Times New Roman"/>
+                <w:b w:val="0"/>
+                <w:sz w:val="20"/>
+              </w:rPr>
+              <w:t>R1</w:t>
+            </w:r>
+          </w:p>
+        </w:tc>
+        <w:tc>
+          <w:tcPr>
+            <w:tcW w:type="dxa" w:w="2448"/>
+            <w:vAlign w:val="center"/>
+          </w:tcPr>
+          <w:p>
+            <w:pPr>
+              <w:spacing w:before="0" w:after="0" w:line="240" w:lineRule="auto"/>
+              <w:jc w:val="left"/>
+            </w:pPr>
+            <w:r/>
+            <w:r>
+              <w:rPr>
+                <w:rFonts w:ascii="Times New Roman" w:hAnsi="Times New Roman" w:eastAsia="Times New Roman"/>
+                <w:b w:val="0"/>
+                <w:sz w:val="20"/>
+              </w:rPr>
+              <w:t>Fa1/0 – NAT outside</w:t>
+            </w:r>
+          </w:p>
+        </w:tc>
+        <w:tc>
+          <w:tcPr>
+            <w:tcW w:type="dxa" w:w="1944"/>
+            <w:vAlign w:val="center"/>
+          </w:tcPr>
+          <w:p>
+            <w:pPr>
+              <w:spacing w:before="0" w:after="0" w:line="240" w:lineRule="auto"/>
+              <w:jc w:val="left"/>
+            </w:pPr>
+            <w:r/>
+            <w:r>
+              <w:rPr>
+                <w:rFonts w:ascii="Times New Roman" w:hAnsi="Times New Roman" w:eastAsia="Times New Roman"/>
+                <w:b w:val="0"/>
+                <w:sz w:val="20"/>
+              </w:rPr>
+              <w:t>192.168.122.100/24</w:t>
+            </w:r>
+          </w:p>
+        </w:tc>
+        <w:tc>
+          <w:tcPr>
+            <w:tcW w:type="dxa" w:w="2448"/>
+            <w:vAlign w:val="center"/>
+          </w:tcPr>
+          <w:p>
+            <w:pPr>
+              <w:spacing w:before="0" w:after="0" w:line="240" w:lineRule="auto"/>
+              <w:jc w:val="left"/>
+            </w:pPr>
+            <w:r/>
+            <w:r>
+              <w:rPr>
+                <w:rFonts w:ascii="Times New Roman" w:hAnsi="Times New Roman" w:eastAsia="Times New Roman"/>
+                <w:b w:val="0"/>
+                <w:sz w:val="20"/>
+              </w:rPr>
+              <w:t>192.168.122.1</w:t>
+            </w:r>
+          </w:p>
+        </w:tc>
+      </w:tr>
+      <w:tr>
+        <w:tc>
+          <w:tcPr>
+            <w:tcW w:type="dxa" w:w="1800"/>
+            <w:vAlign w:val="center"/>
+          </w:tcPr>
+          <w:p>
+            <w:pPr>
+              <w:spacing w:before="0" w:after="0" w:line="240" w:lineRule="auto"/>
+              <w:jc w:val="left"/>
+            </w:pPr>
+            <w:r/>
+            <w:r>
+              <w:rPr>
+                <w:rFonts w:ascii="Times New Roman" w:hAnsi="Times New Roman" w:eastAsia="Times New Roman"/>
+                <w:b w:val="0"/>
+                <w:sz w:val="20"/>
+              </w:rPr>
+              <w:t>R2</w:t>
+            </w:r>
+          </w:p>
+        </w:tc>
+        <w:tc>
+          <w:tcPr>
+            <w:tcW w:type="dxa" w:w="2448"/>
+            <w:vAlign w:val="center"/>
+          </w:tcPr>
+          <w:p>
+            <w:pPr>
+              <w:spacing w:before="0" w:after="0" w:line="240" w:lineRule="auto"/>
+              <w:jc w:val="left"/>
+            </w:pPr>
+            <w:r/>
+            <w:r>
+              <w:rPr>
+                <w:rFonts w:ascii="Times New Roman" w:hAnsi="Times New Roman" w:eastAsia="Times New Roman"/>
+                <w:b w:val="0"/>
+                <w:sz w:val="20"/>
+              </w:rPr>
+              <w:t>Fa0/0 – enlace R1</w:t>
+            </w:r>
+          </w:p>
+        </w:tc>
+        <w:tc>
+          <w:tcPr>
+            <w:tcW w:type="dxa" w:w="1944"/>
+            <w:vAlign w:val="center"/>
+          </w:tcPr>
+          <w:p>
+            <w:pPr>
+              <w:spacing w:before="0" w:after="0" w:line="240" w:lineRule="auto"/>
+              <w:jc w:val="left"/>
+            </w:pPr>
+            <w:r/>
+            <w:r>
+              <w:rPr>
+                <w:rFonts w:ascii="Times New Roman" w:hAnsi="Times New Roman" w:eastAsia="Times New Roman"/>
+                <w:b w:val="0"/>
+                <w:sz w:val="20"/>
+              </w:rPr>
+              <w:t>192.168.2.2/30</w:t>
+            </w:r>
+          </w:p>
+        </w:tc>
+        <w:tc>
+          <w:tcPr>
+            <w:tcW w:type="dxa" w:w="2448"/>
+            <w:vAlign w:val="center"/>
+          </w:tcPr>
+          <w:p>
+            <w:pPr>
+              <w:spacing w:before="0" w:after="0" w:line="240" w:lineRule="auto"/>
+              <w:jc w:val="left"/>
+            </w:pPr>
+            <w:r/>
+            <w:r>
+              <w:rPr>
+                <w:rFonts w:ascii="Times New Roman" w:hAnsi="Times New Roman" w:eastAsia="Times New Roman"/>
+                <w:b w:val="0"/>
+                <w:sz w:val="20"/>
+              </w:rPr>
+              <w:t>192.168.2.1</w:t>
+            </w:r>
+          </w:p>
+        </w:tc>
+      </w:tr>
+      <w:tr>
+        <w:tc>
+          <w:tcPr>
+            <w:tcW w:type="dxa" w:w="1800"/>
+            <w:vAlign w:val="center"/>
+          </w:tcPr>
+          <w:p>
+            <w:pPr>
+              <w:spacing w:before="0" w:after="0" w:line="240" w:lineRule="auto"/>
+              <w:jc w:val="left"/>
+            </w:pPr>
+            <w:r/>
+            <w:r>
+              <w:rPr>
+                <w:rFonts w:ascii="Times New Roman" w:hAnsi="Times New Roman" w:eastAsia="Times New Roman"/>
+                <w:b w:val="0"/>
+                <w:sz w:val="20"/>
+              </w:rPr>
+              <w:t>R2</w:t>
+            </w:r>
+          </w:p>
+        </w:tc>
+        <w:tc>
+          <w:tcPr>
+            <w:tcW w:type="dxa" w:w="2448"/>
+            <w:vAlign w:val="center"/>
+          </w:tcPr>
+          <w:p>
+            <w:pPr>
+              <w:spacing w:before="0" w:after="0" w:line="240" w:lineRule="auto"/>
+              <w:jc w:val="left"/>
+            </w:pPr>
+            <w:r/>
+            <w:r>
+              <w:rPr>
+                <w:rFonts w:ascii="Times New Roman" w:hAnsi="Times New Roman" w:eastAsia="Times New Roman"/>
+                <w:b w:val="0"/>
+                <w:sz w:val="20"/>
+              </w:rPr>
+              <w:t>Fa0/1 – LAN servidores</w:t>
+            </w:r>
+          </w:p>
+        </w:tc>
+        <w:tc>
+          <w:tcPr>
+            <w:tcW w:type="dxa" w:w="1944"/>
+            <w:vAlign w:val="center"/>
+          </w:tcPr>
+          <w:p>
+            <w:pPr>
+              <w:spacing w:before="0" w:after="0" w:line="240" w:lineRule="auto"/>
+              <w:jc w:val="left"/>
+            </w:pPr>
+            <w:r/>
+            <w:r>
+              <w:rPr>
+                <w:rFonts w:ascii="Times New Roman" w:hAnsi="Times New Roman" w:eastAsia="Times New Roman"/>
+                <w:b w:val="0"/>
+                <w:sz w:val="20"/>
+              </w:rPr>
+              <w:t>192.168.3.1/24</w:t>
+            </w:r>
+          </w:p>
+        </w:tc>
+        <w:tc>
+          <w:tcPr>
+            <w:tcW w:type="dxa" w:w="2448"/>
+            <w:vAlign w:val="center"/>
+          </w:tcPr>
+          <w:p>
+            <w:pPr>
+              <w:spacing w:before="0" w:after="0" w:line="240" w:lineRule="auto"/>
+              <w:jc w:val="left"/>
+            </w:pPr>
+            <w:r/>
+            <w:r>
+              <w:rPr>
+                <w:rFonts w:ascii="Times New Roman" w:hAnsi="Times New Roman" w:eastAsia="Times New Roman"/>
+                <w:b w:val="0"/>
+                <w:sz w:val="20"/>
+              </w:rPr>
+              <w:t>—</w:t>
+            </w:r>
+          </w:p>
+        </w:tc>
+      </w:tr>
+      <w:tr>
+        <w:tc>
+          <w:tcPr>
+            <w:tcW w:type="dxa" w:w="1800"/>
+            <w:vAlign w:val="center"/>
+          </w:tcPr>
+          <w:p>
+            <w:pPr>
+              <w:spacing w:before="0" w:after="0" w:line="240" w:lineRule="auto"/>
+              <w:jc w:val="left"/>
+            </w:pPr>
+            <w:r/>
+            <w:r>
+              <w:rPr>
+                <w:rFonts w:ascii="Times New Roman" w:hAnsi="Times New Roman" w:eastAsia="Times New Roman"/>
+                <w:b w:val="0"/>
+                <w:sz w:val="20"/>
+              </w:rPr>
+              <w:t>dc1.redesi.test</w:t>
+            </w:r>
+          </w:p>
+        </w:tc>
+        <w:tc>
+          <w:tcPr>
+            <w:tcW w:type="dxa" w:w="2448"/>
+            <w:vAlign w:val="center"/>
+          </w:tcPr>
+          <w:p>
+            <w:pPr>
+              <w:spacing w:before="0" w:after="0" w:line="240" w:lineRule="auto"/>
+              <w:jc w:val="left"/>
+            </w:pPr>
+            <w:r/>
+            <w:r>
+              <w:rPr>
+                <w:rFonts w:ascii="Times New Roman" w:hAnsi="Times New Roman" w:eastAsia="Times New Roman"/>
+                <w:b w:val="0"/>
+                <w:sz w:val="20"/>
+              </w:rPr>
+              <w:t>ens1 – servidor</w:t>
+            </w:r>
+          </w:p>
+        </w:tc>
+        <w:tc>
+          <w:tcPr>
+            <w:tcW w:type="dxa" w:w="1944"/>
+            <w:vAlign w:val="center"/>
+          </w:tcPr>
+          <w:p>
+            <w:pPr>
+              <w:spacing w:before="0" w:after="0" w:line="240" w:lineRule="auto"/>
+              <w:jc w:val="left"/>
+            </w:pPr>
+            <w:r/>
+            <w:r>
+              <w:rPr>
+                <w:rFonts w:ascii="Times New Roman" w:hAnsi="Times New Roman" w:eastAsia="Times New Roman"/>
+                <w:b w:val="0"/>
+                <w:sz w:val="20"/>
+              </w:rPr>
+              <w:t>192.168.3.2/24</w:t>
+            </w:r>
+          </w:p>
+        </w:tc>
+        <w:tc>
+          <w:tcPr>
+            <w:tcW w:type="dxa" w:w="2448"/>
+            <w:vAlign w:val="center"/>
+          </w:tcPr>
+          <w:p>
+            <w:pPr>
+              <w:spacing w:before="0" w:after="0" w:line="240" w:lineRule="auto"/>
+              <w:jc w:val="left"/>
+            </w:pPr>
+            <w:r/>
+            <w:r>
+              <w:rPr>
+                <w:rFonts w:ascii="Times New Roman" w:hAnsi="Times New Roman" w:eastAsia="Times New Roman"/>
+                <w:b w:val="0"/>
+                <w:sz w:val="20"/>
+              </w:rPr>
+              <w:t>192.168.3.1</w:t>
+            </w:r>
+          </w:p>
+        </w:tc>
+      </w:tr>
+      <w:tr>
+        <w:tc>
+          <w:tcPr>
+            <w:tcW w:type="dxa" w:w="1800"/>
+            <w:vAlign w:val="center"/>
+          </w:tcPr>
+          <w:p>
+            <w:pPr>
+              <w:spacing w:before="0" w:after="0" w:line="240" w:lineRule="auto"/>
+              <w:jc w:val="left"/>
+            </w:pPr>
+            <w:r/>
+            <w:r>
+              <w:rPr>
+                <w:rFonts w:ascii="Times New Roman" w:hAnsi="Times New Roman" w:eastAsia="Times New Roman"/>
+                <w:b w:val="0"/>
+                <w:sz w:val="20"/>
+              </w:rPr>
+              <w:t>cliente1.redesi.test</w:t>
+            </w:r>
+          </w:p>
+        </w:tc>
+        <w:tc>
+          <w:tcPr>
+            <w:tcW w:type="dxa" w:w="2448"/>
+            <w:vAlign w:val="center"/>
+          </w:tcPr>
+          <w:p>
+            <w:pPr>
+              <w:spacing w:before="0" w:after="0" w:line="240" w:lineRule="auto"/>
+              <w:jc w:val="left"/>
+            </w:pPr>
+            <w:r/>
+            <w:r>
+              <w:rPr>
+                <w:rFonts w:ascii="Times New Roman" w:hAnsi="Times New Roman" w:eastAsia="Times New Roman"/>
+                <w:b w:val="0"/>
+                <w:sz w:val="20"/>
+              </w:rPr>
+              <w:t>enp2s0 – cliente</w:t>
+            </w:r>
+          </w:p>
+        </w:tc>
+        <w:tc>
+          <w:tcPr>
+            <w:tcW w:type="dxa" w:w="1944"/>
+            <w:vAlign w:val="center"/>
+          </w:tcPr>
+          <w:p>
+            <w:pPr>
+              <w:spacing w:before="0" w:after="0" w:line="240" w:lineRule="auto"/>
+              <w:jc w:val="left"/>
+            </w:pPr>
+            <w:r/>
+            <w:r>
+              <w:rPr>
+                <w:rFonts w:ascii="Times New Roman" w:hAnsi="Times New Roman" w:eastAsia="Times New Roman"/>
+                <w:b w:val="0"/>
+                <w:sz w:val="20"/>
+              </w:rPr>
+              <w:t>192.168.1.2/24</w:t>
+            </w:r>
+          </w:p>
+        </w:tc>
+        <w:tc>
+          <w:tcPr>
+            <w:tcW w:type="dxa" w:w="2448"/>
+            <w:vAlign w:val="center"/>
+          </w:tcPr>
+          <w:p>
+            <w:pPr>
+              <w:spacing w:before="0" w:after="0" w:line="240" w:lineRule="auto"/>
+              <w:jc w:val="left"/>
+            </w:pPr>
+            <w:r/>
+            <w:r>
+              <w:rPr>
+                <w:rFonts w:ascii="Times New Roman" w:hAnsi="Times New Roman" w:eastAsia="Times New Roman"/>
+                <w:b w:val="0"/>
+                <w:sz w:val="20"/>
+              </w:rPr>
+              <w:t>192.168.1.1</w:t>
+            </w:r>
+          </w:p>
+        </w:tc>
+      </w:tr>
+      <w:tr>
+        <w:tc>
+          <w:tcPr>
+            <w:tcW w:type="dxa" w:w="1800"/>
+            <w:vAlign w:val="center"/>
+          </w:tcPr>
+          <w:p>
+            <w:pPr>
+              <w:spacing w:before="0" w:after="0" w:line="240" w:lineRule="auto"/>
+              <w:jc w:val="left"/>
+            </w:pPr>
+            <w:r/>
+            <w:r>
+              <w:rPr>
+                <w:rFonts w:ascii="Times New Roman" w:hAnsi="Times New Roman" w:eastAsia="Times New Roman"/>
+                <w:b w:val="0"/>
+                <w:sz w:val="20"/>
+              </w:rPr>
+              <w:t>cliente2.redesi.test</w:t>
+            </w:r>
+          </w:p>
+        </w:tc>
+        <w:tc>
+          <w:tcPr>
+            <w:tcW w:type="dxa" w:w="2448"/>
+            <w:vAlign w:val="center"/>
+          </w:tcPr>
+          <w:p>
+            <w:pPr>
+              <w:spacing w:before="0" w:after="0" w:line="240" w:lineRule="auto"/>
+              <w:jc w:val="left"/>
+            </w:pPr>
+            <w:r/>
+            <w:r>
+              <w:rPr>
+                <w:rFonts w:ascii="Times New Roman" w:hAnsi="Times New Roman" w:eastAsia="Times New Roman"/>
+                <w:b w:val="0"/>
+                <w:sz w:val="20"/>
+              </w:rPr>
+              <w:t>enp2s0 – cliente</w:t>
+            </w:r>
+          </w:p>
+        </w:tc>
+        <w:tc>
+          <w:tcPr>
+            <w:tcW w:type="dxa" w:w="1944"/>
+            <w:vAlign w:val="center"/>
+          </w:tcPr>
+          <w:p>
+            <w:pPr>
+              <w:spacing w:before="0" w:after="0" w:line="240" w:lineRule="auto"/>
+              <w:jc w:val="left"/>
+            </w:pPr>
+            <w:r/>
+            <w:r>
+              <w:rPr>
+                <w:rFonts w:ascii="Times New Roman" w:hAnsi="Times New Roman" w:eastAsia="Times New Roman"/>
+                <w:b w:val="0"/>
+                <w:sz w:val="20"/>
+              </w:rPr>
+              <w:t>192.168.1.3/24</w:t>
+            </w:r>
+          </w:p>
+        </w:tc>
+        <w:tc>
+          <w:tcPr>
+            <w:tcW w:type="dxa" w:w="2448"/>
+            <w:vAlign w:val="center"/>
+          </w:tcPr>
+          <w:p>
+            <w:pPr>
+              <w:spacing w:before="0" w:after="0" w:line="240" w:lineRule="auto"/>
+              <w:jc w:val="left"/>
+            </w:pPr>
+            <w:r/>
+            <w:r>
+              <w:rPr>
+                <w:rFonts w:ascii="Times New Roman" w:hAnsi="Times New Roman" w:eastAsia="Times New Roman"/>
+                <w:b w:val="0"/>
+                <w:sz w:val="20"/>
+              </w:rPr>
+              <w:t>192.168.1.1</w:t>
+            </w:r>
+          </w:p>
+        </w:tc>
+      </w:tr>
+    </w:tbl>
+    <w:p>
+      <w:pPr>
+        <w:spacing w:after="40"/>
+      </w:pPr>
+    </w:p>
+    <w:p>
+      <w:pPr>
+        <w:keepNext/>
+        <w:spacing w:line="480" w:lineRule="auto" w:before="160" w:after="80"/>
+        <w:ind w:firstLine="0"/>
+        <w:jc w:val="left"/>
+      </w:pPr>
+      <w:r>
+        <w:rPr>
+          <w:rFonts w:ascii="Times New Roman" w:hAnsi="Times New Roman" w:eastAsia="Times New Roman"/>
+          <w:b/>
+          <w:sz w:val="24"/>
+        </w:rPr>
+        <w:t>2. Enrutamiento, NAT e Internet</w:t>
+      </w:r>
+    </w:p>
+    <w:p>
+      <w:pPr>
+        <w:spacing w:line="480" w:lineRule="auto" w:before="0" w:after="0"/>
+        <w:ind w:firstLine="720"/>
+        <w:jc w:val="left"/>
+      </w:pPr>
+      <w:r>
+        <w:rPr>
+          <w:rFonts w:ascii="Times New Roman" w:hAnsi="Times New Roman" w:eastAsia="Times New Roman"/>
+          <w:sz w:val="24"/>
+        </w:rPr>
+        <w:t>Se completó el enrutamiento estático entre las redes internas. R1 mantiene la ruta hacia 192.168.3.0/24 mediante 192.168.2.2 y R2 mantiene la ruta hacia 192.168.1.0/24 mediante 192.168.2.1. Además, R1 funciona como único punto de salida a Internet mediante PAT, evitando la necesidad de agregar un segundo nodo NAT a la topología.</w:t>
+      </w:r>
+    </w:p>
+    <w:p>
+      <w:pPr>
+        <w:spacing w:before="80" w:after="80" w:line="240" w:lineRule="auto"/>
+        <w:ind w:left="432" w:right="432"/>
+        <w:shd w:fill="F2F2F2"/>
+      </w:pPr>
+      <w:r>
+        <w:rPr>
+          <w:rFonts w:ascii="Consolas" w:hAnsi="Consolas" w:eastAsia="Consolas"/>
+          <w:sz w:val="18"/>
+        </w:rPr>
+        <w:t>R1:</w:t>
+        <w:br/>
+        <w:t xml:space="preserve"> ip route 192.168.3.0 255.255.255.0 192.168.2.2</w:t>
+        <w:br/>
+        <w:t xml:space="preserve"> ip route 0.0.0.0 0.0.0.0 192.168.122.1</w:t>
+        <w:br/>
+        <w:br/>
+        <w:t>R2:</w:t>
+        <w:br/>
+        <w:t xml:space="preserve"> ip route 192.168.1.0 255.255.255.0 192.168.2.1</w:t>
+        <w:br/>
+        <w:t xml:space="preserve"> ip route 0.0.0.0 0.0.0.0 192.168.2.1</w:t>
+      </w:r>
+    </w:p>
+    <w:p>
+      <w:pPr>
+        <w:spacing w:line="480" w:lineRule="auto" w:before="0" w:after="0"/>
+        <w:ind w:firstLine="720"/>
+        <w:jc w:val="left"/>
+      </w:pPr>
+      <w:r>
+        <w:rPr>
+          <w:rFonts w:ascii="Times New Roman" w:hAnsi="Times New Roman" w:eastAsia="Times New Roman"/>
+          <w:sz w:val="24"/>
+        </w:rPr>
+        <w:t>Las pruebas de conectividad confirmaron comunicación extremo a extremo entre los clientes y dc1, así como acceso a Internet desde los clientes y el servidor. También se publicaron puertos SSH en R1 con fines de administración remota, aunque durante la etapa actual se detectó una incidencia con el acceso desde la GNS3 VM hacia los puertos publicados. La comunicación interna R1 → R2 → dc1 por TCP/22 sí fue validada correctamente mediante Telnet.</w:t>
+      </w:r>
+    </w:p>
+    <w:p>
+      <w:pPr>
+        <w:keepNext/>
+        <w:spacing w:line="240" w:lineRule="auto" w:before="120" w:after="0"/>
+        <w:ind w:firstLine="0"/>
+        <w:jc w:val="left"/>
+      </w:pPr>
+      <w:r>
+        <w:rPr>
+          <w:rFonts w:ascii="Times New Roman" w:hAnsi="Times New Roman" w:eastAsia="Times New Roman"/>
+          <w:b/>
+          <w:sz w:val="24"/>
+        </w:rPr>
+        <w:t>Figura 2</w:t>
+      </w:r>
+    </w:p>
+    <w:p>
+      <w:pPr>
+        <w:keepNext/>
+        <w:spacing w:line="240" w:lineRule="auto" w:before="0" w:after="80"/>
+        <w:ind w:firstLine="0"/>
+        <w:jc w:val="left"/>
+      </w:pPr>
+      <w:r>
+        <w:rPr>
+          <w:rFonts w:ascii="Times New Roman" w:hAnsi="Times New Roman" w:eastAsia="Times New Roman"/>
+          <w:i/>
+          <w:sz w:val="24"/>
+        </w:rPr>
+        <w:t>Validación de conectividad SSH entre R1 y dc1.</w:t>
+      </w:r>
+    </w:p>
+    <w:p>
+      <w:pPr>
+        <w:keepNext/>
+        <w:jc w:val="center"/>
+      </w:pPr>
+      <w:r>
+        <w:drawing>
+          <wp:inline>
+            <wp:extent cx="5303520" cy="2654906"/>
+            <wp:docPr id="15" name="Picture 15"/>
+            <wp:cNvGraphicFramePr>
+              <a:graphicFrameLocks noChangeAspect="1"/>
+            </wp:cNvGraphicFramePr>
+            <a:graphic>
+              <a:graphicData uri="http://schemas.openxmlformats.org/drawingml/2006/picture">
+                <pic:pic>
+                  <pic:nvPicPr>
+                    <pic:cNvPr id="0" name="image(20261022-054041).png"/>
+                    <pic:cNvPicPr/>
+                  </pic:nvPicPr>
+                  <pic:blipFill>
+                    <a:blip r:embed="rId20"/>
+                    <a:stretch>
+                      <a:fillRect/>
+                    </a:stretch>
+                  </pic:blipFill>
+                  <pic:spPr>
+                    <a:xfrm>
+                      <a:off x="0" y="0"/>
+                      <a:ext cx="5303520" cy="2654906"/>
+                    </a:xfrm>
+                    <a:prstGeom prst="rect"/>
+                  </pic:spPr>
+                </pic:pic>
+              </a:graphicData>
+            </a:graphic>
+          </wp:inline>
+        </w:drawing>
+      </w:r>
+    </w:p>
+    <w:p>
+      <w:pPr>
+        <w:spacing w:line="240" w:lineRule="auto" w:before="40" w:after="120"/>
+        <w:ind w:firstLine="0"/>
+        <w:jc w:val="left"/>
+      </w:pPr>
+      <w:r>
+        <w:rPr>
+          <w:rFonts w:ascii="Times New Roman" w:hAnsi="Times New Roman" w:eastAsia="Times New Roman"/>
+          <w:i/>
+          <w:sz w:val="20"/>
+        </w:rPr>
+        <w:t xml:space="preserve">Nota. </w:t>
+      </w:r>
+      <w:r>
+        <w:rPr>
+          <w:rFonts w:ascii="Times New Roman" w:hAnsi="Times New Roman" w:eastAsia="Times New Roman"/>
+          <w:sz w:val="20"/>
+        </w:rPr>
+        <w:t>R1 abre correctamente una conexión TCP al puerto 22 de 192.168.3.2 y recibe el banner de OpenSSH, confirmando que el servicio SSH del servidor es alcanzable desde la red interna.</w:t>
+      </w:r>
+    </w:p>
+    <w:p>
+      <w:pPr>
+        <w:keepNext/>
+        <w:spacing w:line="480" w:lineRule="auto" w:before="160" w:after="80"/>
+        <w:ind w:firstLine="0"/>
+        <w:jc w:val="left"/>
+      </w:pPr>
+      <w:r>
+        <w:rPr>
+          <w:rFonts w:ascii="Times New Roman" w:hAnsi="Times New Roman" w:eastAsia="Times New Roman"/>
+          <w:b/>
+          <w:sz w:val="24"/>
+        </w:rPr>
+        <w:t>3. Servidor Debian como controlador de dominio</w:t>
+      </w:r>
+    </w:p>
+    <w:p>
+      <w:pPr>
+        <w:spacing w:line="480" w:lineRule="auto" w:before="0" w:after="0"/>
+        <w:ind w:firstLine="720"/>
+        <w:jc w:val="left"/>
+      </w:pPr>
+      <w:r>
+        <w:rPr>
+          <w:rFonts w:ascii="Times New Roman" w:hAnsi="Times New Roman" w:eastAsia="Times New Roman"/>
+          <w:sz w:val="24"/>
+        </w:rPr>
+        <w:t>ServerDebian-1 fue configurado con hostname dc1 y FQDN dc1.redesi.test. La interfaz interna ens1 utiliza 192.168.3.2/24 y la puerta de enlace 192.168.3.1. La ruta de salida del servidor se mantiene a través de R2, R1 y NAT1, por lo que el servidor participa en la topología real del proyecto y no depende de una conexión NAT directa adicional.</w:t>
+      </w:r>
+    </w:p>
+    <w:p>
+      <w:pPr>
+        <w:spacing w:line="480" w:lineRule="auto" w:before="0" w:after="0"/>
+        <w:ind w:firstLine="720"/>
+        <w:jc w:val="left"/>
+      </w:pPr>
+      <w:r>
+        <w:rPr>
+          <w:rFonts w:ascii="Times New Roman" w:hAnsi="Times New Roman" w:eastAsia="Times New Roman"/>
+          <w:sz w:val="24"/>
+        </w:rPr>
+        <w:t>Samba fue aprovisionado como controlador de dominio Active Directory para el dominio redesi.test y el realm Kerberos REDESI.TEST. Se verificó el servicio samba-ad-dc activo, la resolución del nombre dc1.redesi.test hacia 192.168.3.2 y la existencia de registros SRV de LDAP y Kerberos. El DNS de Samba utiliza un reenviador externo para resolver nombres de Internet.</w:t>
+      </w:r>
+    </w:p>
+    <w:tbl>
+      <w:tblPr>
+        <w:tblW w:type="auto" w:w="0"/>
+        <w:jc w:val="center"/>
+        <w:tblLook w:firstColumn="1" w:firstRow="1" w:lastColumn="0" w:lastRow="0" w:noHBand="0" w:noVBand="1" w:val="04A0"/>
+        <w:tblBorders>
+          <w:top w:val="single" w:sz="4" w:space="0" w:color="000000"/>
+          <w:left w:val="single" w:sz="4" w:space="0" w:color="000000"/>
+          <w:bottom w:val="single" w:sz="4" w:space="0" w:color="000000"/>
+          <w:right w:val="single" w:sz="4" w:space="0" w:color="000000"/>
+          <w:insideH w:val="single" w:sz="4" w:space="0" w:color="000000"/>
+          <w:insideV w:val="single" w:sz="4" w:space="0" w:color="000000"/>
+        </w:tblBorders>
+      </w:tblPr>
+      <w:tblGrid>
+        <w:gridCol w:w="4680"/>
+        <w:gridCol w:w="4680"/>
+      </w:tblGrid>
+      <w:tr>
+        <w:tc>
+          <w:tcPr>
+            <w:tcW w:type="dxa" w:w="3456"/>
+            <w:vAlign w:val="center"/>
+            <w:shd w:fill="B4C6E7"/>
+          </w:tcPr>
+          <w:p>
+            <w:pPr>
+              <w:spacing w:before="0" w:after="0" w:line="240" w:lineRule="auto"/>
+              <w:jc w:val="center"/>
+            </w:pPr>
+            <w:r/>
+            <w:r>
+              <w:rPr>
+                <w:rFonts w:ascii="Times New Roman" w:hAnsi="Times New Roman" w:eastAsia="Times New Roman"/>
+                <w:b/>
+                <w:sz w:val="20"/>
+              </w:rPr>
+              <w:t>Parámetro</w:t>
+            </w:r>
+          </w:p>
+        </w:tc>
+        <w:tc>
+          <w:tcPr>
+            <w:tcW w:type="dxa" w:w="5184"/>
+            <w:vAlign w:val="center"/>
+            <w:shd w:fill="B4C6E7"/>
+          </w:tcPr>
+          <w:p>
+            <w:pPr>
+              <w:spacing w:before="0" w:after="0" w:line="240" w:lineRule="auto"/>
+              <w:jc w:val="center"/>
+            </w:pPr>
+            <w:r/>
+            <w:r>
+              <w:rPr>
+                <w:rFonts w:ascii="Times New Roman" w:hAnsi="Times New Roman" w:eastAsia="Times New Roman"/>
+                <w:b/>
+                <w:sz w:val="20"/>
+              </w:rPr>
+              <w:t>Configuración actual</w:t>
+            </w:r>
+          </w:p>
+        </w:tc>
+      </w:tr>
+      <w:tr>
+        <w:tc>
+          <w:tcPr>
+            <w:tcW w:type="dxa" w:w="3456"/>
+            <w:vAlign w:val="center"/>
+          </w:tcPr>
+          <w:p>
+            <w:pPr>
+              <w:spacing w:before="0" w:after="0" w:line="240" w:lineRule="auto"/>
+              <w:jc w:val="left"/>
+            </w:pPr>
+            <w:r/>
+            <w:r>
+              <w:rPr>
+                <w:rFonts w:ascii="Times New Roman" w:hAnsi="Times New Roman" w:eastAsia="Times New Roman"/>
+                <w:b w:val="0"/>
+                <w:sz w:val="20"/>
+              </w:rPr>
+              <w:t>Hostname</w:t>
+            </w:r>
+          </w:p>
+        </w:tc>
+        <w:tc>
+          <w:tcPr>
+            <w:tcW w:type="dxa" w:w="5184"/>
+            <w:vAlign w:val="center"/>
+          </w:tcPr>
+          <w:p>
+            <w:pPr>
+              <w:spacing w:before="0" w:after="0" w:line="240" w:lineRule="auto"/>
+              <w:jc w:val="left"/>
+            </w:pPr>
+            <w:r/>
+            <w:r>
+              <w:rPr>
+                <w:rFonts w:ascii="Times New Roman" w:hAnsi="Times New Roman" w:eastAsia="Times New Roman"/>
+                <w:b w:val="0"/>
+                <w:sz w:val="20"/>
+              </w:rPr>
+              <w:t>dc1</w:t>
+            </w:r>
+          </w:p>
+        </w:tc>
+      </w:tr>
+      <w:tr>
+        <w:tc>
+          <w:tcPr>
+            <w:tcW w:type="dxa" w:w="3456"/>
+            <w:vAlign w:val="center"/>
+          </w:tcPr>
+          <w:p>
+            <w:pPr>
+              <w:spacing w:before="0" w:after="0" w:line="240" w:lineRule="auto"/>
+              <w:jc w:val="left"/>
+            </w:pPr>
+            <w:r/>
+            <w:r>
+              <w:rPr>
+                <w:rFonts w:ascii="Times New Roman" w:hAnsi="Times New Roman" w:eastAsia="Times New Roman"/>
+                <w:b w:val="0"/>
+                <w:sz w:val="20"/>
+              </w:rPr>
+              <w:t>FQDN</w:t>
+            </w:r>
+          </w:p>
+        </w:tc>
+        <w:tc>
+          <w:tcPr>
+            <w:tcW w:type="dxa" w:w="5184"/>
+            <w:vAlign w:val="center"/>
+          </w:tcPr>
+          <w:p>
+            <w:pPr>
+              <w:spacing w:before="0" w:after="0" w:line="240" w:lineRule="auto"/>
+              <w:jc w:val="left"/>
+            </w:pPr>
+            <w:r/>
+            <w:r>
+              <w:rPr>
+                <w:rFonts w:ascii="Times New Roman" w:hAnsi="Times New Roman" w:eastAsia="Times New Roman"/>
+                <w:b w:val="0"/>
+                <w:sz w:val="20"/>
+              </w:rPr>
+              <w:t>dc1.redesi.test</w:t>
+            </w:r>
+          </w:p>
+        </w:tc>
+      </w:tr>
+      <w:tr>
+        <w:tc>
+          <w:tcPr>
+            <w:tcW w:type="dxa" w:w="3456"/>
+            <w:vAlign w:val="center"/>
+          </w:tcPr>
+          <w:p>
+            <w:pPr>
+              <w:spacing w:before="0" w:after="0" w:line="240" w:lineRule="auto"/>
+              <w:jc w:val="left"/>
+            </w:pPr>
+            <w:r/>
+            <w:r>
+              <w:rPr>
+                <w:rFonts w:ascii="Times New Roman" w:hAnsi="Times New Roman" w:eastAsia="Times New Roman"/>
+                <w:b w:val="0"/>
+                <w:sz w:val="20"/>
+              </w:rPr>
+              <w:t>Dominio DNS</w:t>
+            </w:r>
+          </w:p>
+        </w:tc>
+        <w:tc>
+          <w:tcPr>
+            <w:tcW w:type="dxa" w:w="5184"/>
+            <w:vAlign w:val="center"/>
+          </w:tcPr>
+          <w:p>
+            <w:pPr>
+              <w:spacing w:before="0" w:after="0" w:line="240" w:lineRule="auto"/>
+              <w:jc w:val="left"/>
+            </w:pPr>
+            <w:r/>
+            <w:r>
+              <w:rPr>
+                <w:rFonts w:ascii="Times New Roman" w:hAnsi="Times New Roman" w:eastAsia="Times New Roman"/>
+                <w:b w:val="0"/>
+                <w:sz w:val="20"/>
+              </w:rPr>
+              <w:t>redesi.test</w:t>
+            </w:r>
+          </w:p>
+        </w:tc>
+      </w:tr>
+      <w:tr>
+        <w:tc>
+          <w:tcPr>
+            <w:tcW w:type="dxa" w:w="3456"/>
+            <w:vAlign w:val="center"/>
+          </w:tcPr>
+          <w:p>
+            <w:pPr>
+              <w:spacing w:before="0" w:after="0" w:line="240" w:lineRule="auto"/>
+              <w:jc w:val="left"/>
+            </w:pPr>
+            <w:r/>
+            <w:r>
+              <w:rPr>
+                <w:rFonts w:ascii="Times New Roman" w:hAnsi="Times New Roman" w:eastAsia="Times New Roman"/>
+                <w:b w:val="0"/>
+                <w:sz w:val="20"/>
+              </w:rPr>
+              <w:t>Realm Kerberos</w:t>
+            </w:r>
+          </w:p>
+        </w:tc>
+        <w:tc>
+          <w:tcPr>
+            <w:tcW w:type="dxa" w:w="5184"/>
+            <w:vAlign w:val="center"/>
+          </w:tcPr>
+          <w:p>
+            <w:pPr>
+              <w:spacing w:before="0" w:after="0" w:line="240" w:lineRule="auto"/>
+              <w:jc w:val="left"/>
+            </w:pPr>
+            <w:r/>
+            <w:r>
+              <w:rPr>
+                <w:rFonts w:ascii="Times New Roman" w:hAnsi="Times New Roman" w:eastAsia="Times New Roman"/>
+                <w:b w:val="0"/>
+                <w:sz w:val="20"/>
+              </w:rPr>
+              <w:t>REDESI.TEST</w:t>
+            </w:r>
+          </w:p>
+        </w:tc>
+      </w:tr>
+      <w:tr>
+        <w:tc>
+          <w:tcPr>
+            <w:tcW w:type="dxa" w:w="3456"/>
+            <w:vAlign w:val="center"/>
+          </w:tcPr>
+          <w:p>
+            <w:pPr>
+              <w:spacing w:before="0" w:after="0" w:line="240" w:lineRule="auto"/>
+              <w:jc w:val="left"/>
+            </w:pPr>
+            <w:r/>
+            <w:r>
+              <w:rPr>
+                <w:rFonts w:ascii="Times New Roman" w:hAnsi="Times New Roman" w:eastAsia="Times New Roman"/>
+                <w:b w:val="0"/>
+                <w:sz w:val="20"/>
+              </w:rPr>
+              <w:t>IP del DC</w:t>
+            </w:r>
+          </w:p>
+        </w:tc>
+        <w:tc>
+          <w:tcPr>
+            <w:tcW w:type="dxa" w:w="5184"/>
+            <w:vAlign w:val="center"/>
+          </w:tcPr>
+          <w:p>
+            <w:pPr>
+              <w:spacing w:before="0" w:after="0" w:line="240" w:lineRule="auto"/>
+              <w:jc w:val="left"/>
+            </w:pPr>
+            <w:r/>
+            <w:r>
+              <w:rPr>
+                <w:rFonts w:ascii="Times New Roman" w:hAnsi="Times New Roman" w:eastAsia="Times New Roman"/>
+                <w:b w:val="0"/>
+                <w:sz w:val="20"/>
+              </w:rPr>
+              <w:t>192.168.3.2/24</w:t>
+            </w:r>
+          </w:p>
+        </w:tc>
+      </w:tr>
+      <w:tr>
+        <w:tc>
+          <w:tcPr>
+            <w:tcW w:type="dxa" w:w="3456"/>
+            <w:vAlign w:val="center"/>
+          </w:tcPr>
+          <w:p>
+            <w:pPr>
+              <w:spacing w:before="0" w:after="0" w:line="240" w:lineRule="auto"/>
+              <w:jc w:val="left"/>
+            </w:pPr>
+            <w:r/>
+            <w:r>
+              <w:rPr>
+                <w:rFonts w:ascii="Times New Roman" w:hAnsi="Times New Roman" w:eastAsia="Times New Roman"/>
+                <w:b w:val="0"/>
+                <w:sz w:val="20"/>
+              </w:rPr>
+              <w:t>Gateway</w:t>
+            </w:r>
+          </w:p>
+        </w:tc>
+        <w:tc>
+          <w:tcPr>
+            <w:tcW w:type="dxa" w:w="5184"/>
+            <w:vAlign w:val="center"/>
+          </w:tcPr>
+          <w:p>
+            <w:pPr>
+              <w:spacing w:before="0" w:after="0" w:line="240" w:lineRule="auto"/>
+              <w:jc w:val="left"/>
+            </w:pPr>
+            <w:r/>
+            <w:r>
+              <w:rPr>
+                <w:rFonts w:ascii="Times New Roman" w:hAnsi="Times New Roman" w:eastAsia="Times New Roman"/>
+                <w:b w:val="0"/>
+                <w:sz w:val="20"/>
+              </w:rPr>
+              <w:t>192.168.3.1</w:t>
+            </w:r>
+          </w:p>
+        </w:tc>
+      </w:tr>
+      <w:tr>
+        <w:tc>
+          <w:tcPr>
+            <w:tcW w:type="dxa" w:w="3456"/>
+            <w:vAlign w:val="center"/>
+          </w:tcPr>
+          <w:p>
+            <w:pPr>
+              <w:spacing w:before="0" w:after="0" w:line="240" w:lineRule="auto"/>
+              <w:jc w:val="left"/>
+            </w:pPr>
+            <w:r/>
+            <w:r>
+              <w:rPr>
+                <w:rFonts w:ascii="Times New Roman" w:hAnsi="Times New Roman" w:eastAsia="Times New Roman"/>
+                <w:b w:val="0"/>
+                <w:sz w:val="20"/>
+              </w:rPr>
+              <w:t>DNS local del servidor</w:t>
+            </w:r>
+          </w:p>
+        </w:tc>
+        <w:tc>
+          <w:tcPr>
+            <w:tcW w:type="dxa" w:w="5184"/>
+            <w:vAlign w:val="center"/>
+          </w:tcPr>
+          <w:p>
+            <w:pPr>
+              <w:spacing w:before="0" w:after="0" w:line="240" w:lineRule="auto"/>
+              <w:jc w:val="left"/>
+            </w:pPr>
+            <w:r/>
+            <w:r>
+              <w:rPr>
+                <w:rFonts w:ascii="Times New Roman" w:hAnsi="Times New Roman" w:eastAsia="Times New Roman"/>
+                <w:b w:val="0"/>
+                <w:sz w:val="20"/>
+              </w:rPr>
+              <w:t>127.0.0.1</w:t>
+            </w:r>
+          </w:p>
+        </w:tc>
+      </w:tr>
+      <w:tr>
+        <w:tc>
+          <w:tcPr>
+            <w:tcW w:type="dxa" w:w="3456"/>
+            <w:vAlign w:val="center"/>
+          </w:tcPr>
+          <w:p>
+            <w:pPr>
+              <w:spacing w:before="0" w:after="0" w:line="240" w:lineRule="auto"/>
+              <w:jc w:val="left"/>
+            </w:pPr>
+            <w:r/>
+            <w:r>
+              <w:rPr>
+                <w:rFonts w:ascii="Times New Roman" w:hAnsi="Times New Roman" w:eastAsia="Times New Roman"/>
+                <w:b w:val="0"/>
+                <w:sz w:val="20"/>
+              </w:rPr>
+              <w:t>DNS forwarder de Samba</w:t>
+            </w:r>
+          </w:p>
+        </w:tc>
+        <w:tc>
+          <w:tcPr>
+            <w:tcW w:type="dxa" w:w="5184"/>
+            <w:vAlign w:val="center"/>
+          </w:tcPr>
+          <w:p>
+            <w:pPr>
+              <w:spacing w:before="0" w:after="0" w:line="240" w:lineRule="auto"/>
+              <w:jc w:val="left"/>
+            </w:pPr>
+            <w:r/>
+            <w:r>
+              <w:rPr>
+                <w:rFonts w:ascii="Times New Roman" w:hAnsi="Times New Roman" w:eastAsia="Times New Roman"/>
+                <w:b w:val="0"/>
+                <w:sz w:val="20"/>
+              </w:rPr>
+              <w:t>1.1.1.1</w:t>
+            </w:r>
+          </w:p>
+        </w:tc>
+      </w:tr>
+    </w:tbl>
+    <w:p>
+      <w:pPr>
+        <w:spacing w:after="40"/>
+      </w:pPr>
+    </w:p>
+    <w:p>
+      <w:pPr>
+        <w:keepNext/>
+        <w:spacing w:line="480" w:lineRule="auto" w:before="160" w:after="80"/>
+        <w:ind w:firstLine="0"/>
+        <w:jc w:val="left"/>
+      </w:pPr>
+      <w:r>
+        <w:rPr>
+          <w:rFonts w:ascii="Times New Roman" w:hAnsi="Times New Roman" w:eastAsia="Times New Roman"/>
+          <w:b/>
+          <w:sz w:val="24"/>
+        </w:rPr>
+        <w:t>4. Usuarios de Active Directory</w:t>
+      </w:r>
+    </w:p>
+    <w:p>
+      <w:pPr>
+        <w:spacing w:line="480" w:lineRule="auto" w:before="0" w:after="0"/>
+        <w:ind w:firstLine="720"/>
+        <w:jc w:val="left"/>
+      </w:pPr>
+      <w:r>
+        <w:rPr>
+          <w:rFonts w:ascii="Times New Roman" w:hAnsi="Times New Roman" w:eastAsia="Times New Roman"/>
+          <w:sz w:val="24"/>
+        </w:rPr>
+        <w:t>Además de la cuenta administrativa del dominio, se crearon cuentas de prueba para demostrar la administración centralizada de usuarios. usuario1 ya había sido utilizado para validar el acceso desde los clientes. Posteriormente se creó usuario2 para mostrar una segunda identidad de dominio y realizar una demostración más clara utilizando un usuario diferente en cliente2.</w:t>
+      </w:r>
+    </w:p>
+    <w:p>
+      <w:pPr>
+        <w:spacing w:before="80" w:after="80" w:line="240" w:lineRule="auto"/>
+        <w:ind w:left="432" w:right="432"/>
+        <w:shd w:fill="F2F2F2"/>
+      </w:pPr>
+      <w:r>
+        <w:rPr>
+          <w:rFonts w:ascii="Consolas" w:hAnsi="Consolas" w:eastAsia="Consolas"/>
+          <w:sz w:val="18"/>
+        </w:rPr>
+        <w:t>samba-tool user create usuario2</w:t>
+        <w:br/>
+        <w:t>samba-tool user list</w:t>
+        <w:br/>
+        <w:t>samba-tool user show usuario2</w:t>
+      </w:r>
+    </w:p>
+    <w:p>
+      <w:pPr>
+        <w:keepNext/>
+        <w:spacing w:line="240" w:lineRule="auto" w:before="120" w:after="0"/>
+        <w:ind w:firstLine="0"/>
+        <w:jc w:val="left"/>
+      </w:pPr>
+      <w:r>
+        <w:rPr>
+          <w:rFonts w:ascii="Times New Roman" w:hAnsi="Times New Roman" w:eastAsia="Times New Roman"/>
+          <w:b/>
+          <w:sz w:val="24"/>
+        </w:rPr>
+        <w:t>Figura 3</w:t>
+      </w:r>
+    </w:p>
+    <w:p>
+      <w:pPr>
+        <w:keepNext/>
+        <w:spacing w:line="240" w:lineRule="auto" w:before="0" w:after="80"/>
+        <w:ind w:firstLine="0"/>
+        <w:jc w:val="left"/>
+      </w:pPr>
+      <w:r>
+        <w:rPr>
+          <w:rFonts w:ascii="Times New Roman" w:hAnsi="Times New Roman" w:eastAsia="Times New Roman"/>
+          <w:i/>
+          <w:sz w:val="24"/>
+        </w:rPr>
+        <w:t>Creación y verificación de usuario2 en Samba Active Directory.</w:t>
+      </w:r>
+    </w:p>
+    <w:p>
+      <w:pPr>
+        <w:keepNext/>
+        <w:jc w:val="center"/>
+      </w:pPr>
+      <w:r>
+        <w:drawing>
+          <wp:inline>
+            <wp:extent cx="5394960" cy="4449090"/>
+            <wp:docPr id="16" name="Picture 16"/>
+            <wp:cNvGraphicFramePr>
+              <a:graphicFrameLocks noChangeAspect="1"/>
+            </wp:cNvGraphicFramePr>
+            <a:graphic>
+              <a:graphicData uri="http://schemas.openxmlformats.org/drawingml/2006/picture">
+                <pic:pic>
+                  <pic:nvPicPr>
+                    <pic:cNvPr id="0" name="fig15_usuario2_dc1.png"/>
+                    <pic:cNvPicPr/>
+                  </pic:nvPicPr>
+                  <pic:blipFill>
+                    <a:blip r:embed="rId21"/>
+                    <a:stretch>
+                      <a:fillRect/>
+                    </a:stretch>
+                  </pic:blipFill>
+                  <pic:spPr>
+                    <a:xfrm>
+                      <a:off x="0" y="0"/>
+                      <a:ext cx="5394960" cy="4449090"/>
+                    </a:xfrm>
+                    <a:prstGeom prst="rect"/>
+                  </pic:spPr>
+                </pic:pic>
+              </a:graphicData>
+            </a:graphic>
+          </wp:inline>
+        </w:drawing>
+      </w:r>
+    </w:p>
+    <w:p>
+      <w:pPr>
+        <w:spacing w:line="240" w:lineRule="auto" w:before="40" w:after="120"/>
+        <w:ind w:firstLine="0"/>
+        <w:jc w:val="left"/>
+      </w:pPr>
+      <w:r>
+        <w:rPr>
+          <w:rFonts w:ascii="Times New Roman" w:hAnsi="Times New Roman" w:eastAsia="Times New Roman"/>
+          <w:i/>
+          <w:sz w:val="20"/>
+        </w:rPr>
+        <w:t xml:space="preserve">Nota. </w:t>
+      </w:r>
+      <w:r>
+        <w:rPr>
+          <w:rFonts w:ascii="Times New Roman" w:hAnsi="Times New Roman" w:eastAsia="Times New Roman"/>
+          <w:sz w:val="20"/>
+        </w:rPr>
+        <w:t>La salida confirma que usuario2 fue agregado correctamente y aparece dentro del contenedor Users del dominio redesi.test.</w:t>
+      </w:r>
+    </w:p>
+    <w:p>
+      <w:pPr>
+        <w:keepNext/>
+        <w:spacing w:line="480" w:lineRule="auto" w:before="160" w:after="80"/>
+        <w:ind w:firstLine="0"/>
+        <w:jc w:val="left"/>
+      </w:pPr>
+      <w:r>
+        <w:rPr>
+          <w:rFonts w:ascii="Times New Roman" w:hAnsi="Times New Roman" w:eastAsia="Times New Roman"/>
+          <w:b/>
+          <w:sz w:val="24"/>
+        </w:rPr>
+        <w:t>5. Integración de DebianClient1 y DebianClient2 al dominio</w:t>
+      </w:r>
+    </w:p>
+    <w:p>
+      <w:pPr>
+        <w:spacing w:line="480" w:lineRule="auto" w:before="0" w:after="0"/>
+        <w:ind w:firstLine="720"/>
+        <w:jc w:val="left"/>
+      </w:pPr>
+      <w:r>
+        <w:rPr>
+          <w:rFonts w:ascii="Times New Roman" w:hAnsi="Times New Roman" w:eastAsia="Times New Roman"/>
+          <w:sz w:val="24"/>
+        </w:rPr>
+        <w:t>Los dos clientes actuales utilizan Debian 13 con XFCE y están unidos de forma independiente al dominio redesi.test. La integración se realizó con realmd, SSSD, Kerberos y PAM. Ambos equipos quedaron registrados como kerberos-member y poseen cuentas de computadora diferentes en Active Directory, por lo que la clonación de cliente2 no genera conflicto con CLIENTE1$.</w:t>
+      </w:r>
+    </w:p>
+    <w:p>
+      <w:pPr>
+        <w:spacing w:before="80" w:after="80" w:line="240" w:lineRule="auto"/>
+        <w:ind w:left="432" w:right="432"/>
+        <w:shd w:fill="F2F2F2"/>
+      </w:pPr>
+      <w:r>
+        <w:rPr>
+          <w:rFonts w:ascii="Consolas" w:hAnsi="Consolas" w:eastAsia="Consolas"/>
+          <w:sz w:val="18"/>
+        </w:rPr>
+        <w:t>realm discover redesi.test</w:t>
+        <w:br/>
+        <w:t>realm join -v --install=/ -U Administrator redesi.test</w:t>
+        <w:br/>
+        <w:t>realm list</w:t>
+        <w:br/>
+        <w:t>systemctl restart sssd</w:t>
+        <w:br/>
+        <w:t>sss_cache -E</w:t>
+        <w:br/>
+        <w:t>pam-auth-update --enable mkhomedir</w:t>
+      </w:r>
+    </w:p>
+    <w:p>
+      <w:pPr>
+        <w:spacing w:line="480" w:lineRule="auto" w:before="0" w:after="0"/>
+        <w:ind w:firstLine="720"/>
+        <w:jc w:val="left"/>
+      </w:pPr>
+      <w:r>
+        <w:rPr>
+          <w:rFonts w:ascii="Times New Roman" w:hAnsi="Times New Roman" w:eastAsia="Times New Roman"/>
+          <w:sz w:val="24"/>
+        </w:rPr>
+        <w:t>Se configuró use_fully_qualified_names = False en SSSD para permitir el uso de nombres cortos, por ejemplo usuario1 y usuario2, y pam_mkhomedir para crear el directorio personal durante el primer inicio de sesión. LightDM se configuró para permitir ingreso manual de credenciales del dominio.</w:t>
+      </w:r>
+    </w:p>
+    <w:p>
+      <w:pPr>
+        <w:keepNext/>
+        <w:spacing w:line="480" w:lineRule="auto" w:before="160" w:after="80"/>
+        <w:ind w:firstLine="0"/>
+        <w:jc w:val="left"/>
+      </w:pPr>
+      <w:r>
+        <w:rPr>
+          <w:rFonts w:ascii="Times New Roman" w:hAnsi="Times New Roman" w:eastAsia="Times New Roman"/>
+          <w:b/>
+          <w:sz w:val="24"/>
+        </w:rPr>
+        <w:t>5.1 Validación de usuario2 en cliente2</w:t>
+      </w:r>
+    </w:p>
+    <w:p>
+      <w:pPr>
+        <w:spacing w:line="480" w:lineRule="auto" w:before="0" w:after="0"/>
+        <w:ind w:firstLine="720"/>
+        <w:jc w:val="left"/>
+      </w:pPr>
+      <w:r>
+        <w:rPr>
+          <w:rFonts w:ascii="Times New Roman" w:hAnsi="Times New Roman" w:eastAsia="Times New Roman"/>
+          <w:sz w:val="24"/>
+        </w:rPr>
+        <w:t>En cliente2 se confirmó que SSSD resuelve la cuenta usuario2, que la autenticación PAM funciona mediante su, que se crea automáticamente el directorio /home/usuario2@redesi.test y que el usuario obtiene un ticket Kerberos válido. La prueba whoami devolvió usuario2, id mostró la pertenencia a domain users y hostname -f confirmó cliente2.redesi.test.</w:t>
+      </w:r>
+    </w:p>
+    <w:p>
+      <w:pPr>
+        <w:keepNext/>
+        <w:spacing w:line="240" w:lineRule="auto" w:before="120" w:after="0"/>
+        <w:ind w:firstLine="0"/>
+        <w:jc w:val="left"/>
+      </w:pPr>
+      <w:r>
+        <w:rPr>
+          <w:rFonts w:ascii="Times New Roman" w:hAnsi="Times New Roman" w:eastAsia="Times New Roman"/>
+          <w:b/>
+          <w:sz w:val="24"/>
+        </w:rPr>
+        <w:t>Figura 4</w:t>
+      </w:r>
+    </w:p>
+    <w:p>
+      <w:pPr>
+        <w:keepNext/>
+        <w:spacing w:line="240" w:lineRule="auto" w:before="0" w:after="80"/>
+        <w:ind w:firstLine="0"/>
+        <w:jc w:val="left"/>
+      </w:pPr>
+      <w:r>
+        <w:rPr>
+          <w:rFonts w:ascii="Times New Roman" w:hAnsi="Times New Roman" w:eastAsia="Times New Roman"/>
+          <w:i/>
+          <w:sz w:val="24"/>
+        </w:rPr>
+        <w:t>Autenticación de usuario2 y ticket Kerberos en cliente2.</w:t>
+      </w:r>
+    </w:p>
+    <w:p>
+      <w:pPr>
+        <w:keepNext/>
+        <w:jc w:val="center"/>
+      </w:pPr>
+      <w:r>
+        <w:drawing>
+          <wp:inline>
+            <wp:extent cx="5669280" cy="4323653"/>
+            <wp:docPr id="17" name="Picture 17"/>
+            <wp:cNvGraphicFramePr>
+              <a:graphicFrameLocks noChangeAspect="1"/>
+            </wp:cNvGraphicFramePr>
+            <a:graphic>
+              <a:graphicData uri="http://schemas.openxmlformats.org/drawingml/2006/picture">
+                <pic:pic>
+                  <pic:nvPicPr>
+                    <pic:cNvPr id="0" name="image(20261021-051121).png"/>
+                    <pic:cNvPicPr/>
+                  </pic:nvPicPr>
+                  <pic:blipFill>
+                    <a:blip r:embed="rId22"/>
+                    <a:stretch>
+                      <a:fillRect/>
+                    </a:stretch>
+                  </pic:blipFill>
+                  <pic:spPr>
+                    <a:xfrm>
+                      <a:off x="0" y="0"/>
+                      <a:ext cx="5669280" cy="4323653"/>
+                    </a:xfrm>
+                    <a:prstGeom prst="rect"/>
+                  </pic:spPr>
+                </pic:pic>
+              </a:graphicData>
+            </a:graphic>
+          </wp:inline>
+        </w:drawing>
+      </w:r>
+    </w:p>
+    <w:p>
+      <w:pPr>
+        <w:spacing w:line="240" w:lineRule="auto" w:before="40" w:after="120"/>
+        <w:ind w:firstLine="0"/>
+        <w:jc w:val="left"/>
+      </w:pPr>
+      <w:r>
+        <w:rPr>
+          <w:rFonts w:ascii="Times New Roman" w:hAnsi="Times New Roman" w:eastAsia="Times New Roman"/>
+          <w:i/>
+          <w:sz w:val="20"/>
+        </w:rPr>
+        <w:t xml:space="preserve">Nota. </w:t>
+      </w:r>
+      <w:r>
+        <w:rPr>
+          <w:rFonts w:ascii="Times New Roman" w:hAnsi="Times New Roman" w:eastAsia="Times New Roman"/>
+          <w:sz w:val="20"/>
+        </w:rPr>
+        <w:t>La evidencia muestra id usuario2, creación del directorio personal, whoami, hostname -f, kinit usuario2 y klist con Default principal usuario2@REDESI.TEST.</w:t>
+      </w:r>
+    </w:p>
+    <w:p>
+      <w:pPr>
+        <w:keepNext/>
+        <w:spacing w:line="480" w:lineRule="auto" w:before="160" w:after="80"/>
+        <w:ind w:firstLine="0"/>
+        <w:jc w:val="left"/>
+      </w:pPr>
+      <w:r>
+        <w:rPr>
+          <w:rFonts w:ascii="Times New Roman" w:hAnsi="Times New Roman" w:eastAsia="Times New Roman"/>
+          <w:b/>
+          <w:sz w:val="24"/>
+        </w:rPr>
+        <w:t>6. Optimización de recursos de las máquinas virtuales</w:t>
+      </w:r>
+    </w:p>
+    <w:p>
+      <w:pPr>
+        <w:spacing w:line="480" w:lineRule="auto" w:before="0" w:after="0"/>
+        <w:ind w:firstLine="720"/>
+        <w:jc w:val="left"/>
+      </w:pPr>
+      <w:r>
+        <w:rPr>
+          <w:rFonts w:ascii="Times New Roman" w:hAnsi="Times New Roman" w:eastAsia="Times New Roman"/>
+          <w:sz w:val="24"/>
+        </w:rPr>
+        <w:t>Antes de continuar con los servicios de esta semana se revisó el consumo de recursos, debido a que la GNS3 VM dispone de 5 GB de RAM y no era posible mantener todo el proyecto encendido con comodidad. Se comenzó a reducir la memoria asignada a los clientes Debian a aproximadamente 1 GB. Durante el diagnóstico, DebianClient1 ya aparecía arrancando con aproximadamente 1048 MB de RAM; el registro todavía mostraba dos vCPU, por lo que se dejó como ajuste recomendado reducir los clientes y el servidor a un vCPU cuando sea necesario.</w:t>
+      </w:r>
+    </w:p>
+    <w:p>
+      <w:pPr>
+        <w:spacing w:line="480" w:lineRule="auto" w:before="0" w:after="0"/>
+        <w:ind w:firstLine="720"/>
+        <w:jc w:val="left"/>
+      </w:pPr>
+      <w:r>
+        <w:rPr>
+          <w:rFonts w:ascii="Times New Roman" w:hAnsi="Times New Roman" w:eastAsia="Times New Roman"/>
+          <w:sz w:val="24"/>
+        </w:rPr>
+        <w:t>Esta optimización no cambia el direccionamiento, las cuentas del dominio ni los discos qcow2. Su objetivo es permitir que R1, R2, dc1, cliente1 y cliente2 permanezcan activos simultáneamente durante las demostraciones.</w:t>
+      </w:r>
+    </w:p>
+    <w:p>
+      <w:pPr>
+        <w:keepNext/>
+        <w:spacing w:line="480" w:lineRule="auto" w:before="160" w:after="80"/>
+        <w:ind w:firstLine="0"/>
+        <w:jc w:val="left"/>
+      </w:pPr>
+      <w:r>
+        <w:rPr>
+          <w:rFonts w:ascii="Times New Roman" w:hAnsi="Times New Roman" w:eastAsia="Times New Roman"/>
+          <w:b/>
+          <w:sz w:val="24"/>
+        </w:rPr>
+        <w:t>7. Incidencia de administración HTTPS en GNS3</w:t>
+      </w:r>
+    </w:p>
+    <w:p>
+      <w:pPr>
+        <w:spacing w:line="480" w:lineRule="auto" w:before="0" w:after="0"/>
+        <w:ind w:firstLine="720"/>
+        <w:jc w:val="left"/>
+      </w:pPr>
+      <w:r>
+        <w:rPr>
+          <w:rFonts w:ascii="Times New Roman" w:hAnsi="Times New Roman" w:eastAsia="Times New Roman"/>
+          <w:sz w:val="24"/>
+        </w:rPr>
+        <w:t>El controlador remoto de GNS3 fue configurado mediante HTTPS en 192.168.56.102:443. Después del cambio, el cliente gráfico comenzó a mostrar de manera intermitente el mensaje Connection closed (HTTP code None) al iniciar o detener nodos. Las pruebas demostraron que el servidor sí ejecuta la operación y posteriormente emite el evento node.updated con el estado correcto del nodo; por tanto, la incidencia afecta la respuesta de la interfaz de administración y no la funcionalidad de la topología.</w:t>
+      </w:r>
+    </w:p>
+    <w:p>
+      <w:pPr>
+        <w:spacing w:line="480" w:lineRule="auto" w:before="0" w:after="0"/>
+        <w:ind w:firstLine="720"/>
+        <w:jc w:val="left"/>
+      </w:pPr>
+      <w:r>
+        <w:rPr>
+          <w:rFonts w:ascii="Times New Roman" w:hAnsi="Times New Roman" w:eastAsia="Times New Roman"/>
+          <w:sz w:val="24"/>
+        </w:rPr>
+        <w:t>La consulta HTTPS /v3/version respondió HTTP 200 OK y la autenticación del controlador generó correctamente un token de acceso. Se decidió dejar esta incidencia documentada y continuar con el proyecto, ya que no afecta AD, DNS, Kerberos, enrutamiento ni los servicios que se están implementando.</w:t>
+      </w:r>
+    </w:p>
+    <w:p>
+      <w:pPr>
+        <w:keepNext/>
+        <w:spacing w:line="480" w:lineRule="auto" w:before="160" w:after="80"/>
+        <w:ind w:firstLine="0"/>
+        <w:jc w:val="left"/>
+      </w:pPr>
+      <w:r>
+        <w:rPr>
+          <w:rFonts w:ascii="Times New Roman" w:hAnsi="Times New Roman" w:eastAsia="Times New Roman"/>
+          <w:b/>
+          <w:sz w:val="24"/>
+        </w:rPr>
+        <w:t>8. Implementación de DHCP – avance de la entrega semanal</w:t>
+      </w:r>
+    </w:p>
+    <w:p>
+      <w:pPr>
+        <w:spacing w:line="480" w:lineRule="auto" w:before="0" w:after="0"/>
+        <w:ind w:firstLine="720"/>
+        <w:jc w:val="left"/>
+      </w:pPr>
+      <w:r>
+        <w:rPr>
+          <w:rFonts w:ascii="Times New Roman" w:hAnsi="Times New Roman" w:eastAsia="Times New Roman"/>
+          <w:sz w:val="24"/>
+        </w:rPr>
+        <w:t>El siguiente servicio en implementación es DHCP. El diseño conserva dc1 como servidor central y utilizará R1 como DHCP Relay para la LAN 192.168.1.0/24. Con este enfoque, los clientes obtendrán automáticamente dirección IPv4, gateway, DNS y dominio sin instalar un segundo servidor en la red de clientes.</w:t>
+      </w:r>
+    </w:p>
+    <w:tbl>
+      <w:tblPr>
+        <w:tblW w:type="auto" w:w="0"/>
+        <w:jc w:val="center"/>
+        <w:tblLook w:firstColumn="1" w:firstRow="1" w:lastColumn="0" w:lastRow="0" w:noHBand="0" w:noVBand="1" w:val="04A0"/>
+        <w:tblBorders>
+          <w:top w:val="single" w:sz="4" w:space="0" w:color="000000"/>
+          <w:left w:val="single" w:sz="4" w:space="0" w:color="000000"/>
+          <w:bottom w:val="single" w:sz="4" w:space="0" w:color="000000"/>
+          <w:right w:val="single" w:sz="4" w:space="0" w:color="000000"/>
+          <w:insideH w:val="single" w:sz="4" w:space="0" w:color="000000"/>
+          <w:insideV w:val="single" w:sz="4" w:space="0" w:color="000000"/>
+        </w:tblBorders>
+      </w:tblPr>
+      <w:tblGrid>
+        <w:gridCol w:w="4680"/>
+        <w:gridCol w:w="4680"/>
+      </w:tblGrid>
+      <w:tr>
+        <w:tc>
+          <w:tcPr>
+            <w:tcW w:type="dxa" w:w="3312"/>
+            <w:vAlign w:val="center"/>
+            <w:shd w:fill="B4C6E7"/>
+          </w:tcPr>
+          <w:p>
+            <w:pPr>
+              <w:spacing w:before="0" w:after="0" w:line="240" w:lineRule="auto"/>
+              <w:jc w:val="center"/>
+            </w:pPr>
+            <w:r/>
+            <w:r>
+              <w:rPr>
+                <w:rFonts w:ascii="Times New Roman" w:hAnsi="Times New Roman" w:eastAsia="Times New Roman"/>
+                <w:b/>
+                <w:sz w:val="20"/>
+              </w:rPr>
+              <w:t>Opción DHCP</w:t>
+            </w:r>
+          </w:p>
+        </w:tc>
+        <w:tc>
+          <w:tcPr>
+            <w:tcW w:type="dxa" w:w="5328"/>
+            <w:vAlign w:val="center"/>
+            <w:shd w:fill="B4C6E7"/>
+          </w:tcPr>
+          <w:p>
+            <w:pPr>
+              <w:spacing w:before="0" w:after="0" w:line="240" w:lineRule="auto"/>
+              <w:jc w:val="center"/>
+            </w:pPr>
+            <w:r/>
+            <w:r>
+              <w:rPr>
+                <w:rFonts w:ascii="Times New Roman" w:hAnsi="Times New Roman" w:eastAsia="Times New Roman"/>
+                <w:b/>
+                <w:sz w:val="20"/>
+              </w:rPr>
+              <w:t>Valor planificado</w:t>
+            </w:r>
+          </w:p>
+        </w:tc>
+      </w:tr>
+      <w:tr>
+        <w:tc>
+          <w:tcPr>
+            <w:tcW w:type="dxa" w:w="3312"/>
+            <w:vAlign w:val="center"/>
+          </w:tcPr>
+          <w:p>
+            <w:pPr>
+              <w:spacing w:before="0" w:after="0" w:line="240" w:lineRule="auto"/>
+              <w:jc w:val="left"/>
+            </w:pPr>
+            <w:r/>
+            <w:r>
+              <w:rPr>
+                <w:rFonts w:ascii="Times New Roman" w:hAnsi="Times New Roman" w:eastAsia="Times New Roman"/>
+                <w:b w:val="0"/>
+                <w:sz w:val="20"/>
+              </w:rPr>
+              <w:t>Subred de clientes</w:t>
+            </w:r>
+          </w:p>
+        </w:tc>
+        <w:tc>
+          <w:tcPr>
+            <w:tcW w:type="dxa" w:w="5328"/>
+            <w:vAlign w:val="center"/>
+          </w:tcPr>
+          <w:p>
+            <w:pPr>
+              <w:spacing w:before="0" w:after="0" w:line="240" w:lineRule="auto"/>
+              <w:jc w:val="left"/>
+            </w:pPr>
+            <w:r/>
+            <w:r>
+              <w:rPr>
+                <w:rFonts w:ascii="Times New Roman" w:hAnsi="Times New Roman" w:eastAsia="Times New Roman"/>
+                <w:b w:val="0"/>
+                <w:sz w:val="20"/>
+              </w:rPr>
+              <w:t>192.168.1.0/24</w:t>
+            </w:r>
+          </w:p>
+        </w:tc>
+      </w:tr>
+      <w:tr>
+        <w:tc>
+          <w:tcPr>
+            <w:tcW w:type="dxa" w:w="3312"/>
+            <w:vAlign w:val="center"/>
+          </w:tcPr>
+          <w:p>
+            <w:pPr>
+              <w:spacing w:before="0" w:after="0" w:line="240" w:lineRule="auto"/>
+              <w:jc w:val="left"/>
+            </w:pPr>
+            <w:r/>
+            <w:r>
+              <w:rPr>
+                <w:rFonts w:ascii="Times New Roman" w:hAnsi="Times New Roman" w:eastAsia="Times New Roman"/>
+                <w:b w:val="0"/>
+                <w:sz w:val="20"/>
+              </w:rPr>
+              <w:t>Gateway entregado</w:t>
+            </w:r>
+          </w:p>
+        </w:tc>
+        <w:tc>
+          <w:tcPr>
+            <w:tcW w:type="dxa" w:w="5328"/>
+            <w:vAlign w:val="center"/>
+          </w:tcPr>
+          <w:p>
+            <w:pPr>
+              <w:spacing w:before="0" w:after="0" w:line="240" w:lineRule="auto"/>
+              <w:jc w:val="left"/>
+            </w:pPr>
+            <w:r/>
+            <w:r>
+              <w:rPr>
+                <w:rFonts w:ascii="Times New Roman" w:hAnsi="Times New Roman" w:eastAsia="Times New Roman"/>
+                <w:b w:val="0"/>
+                <w:sz w:val="20"/>
+              </w:rPr>
+              <w:t>192.168.1.1</w:t>
+            </w:r>
+          </w:p>
+        </w:tc>
+      </w:tr>
+      <w:tr>
+        <w:tc>
+          <w:tcPr>
+            <w:tcW w:type="dxa" w:w="3312"/>
+            <w:vAlign w:val="center"/>
+          </w:tcPr>
+          <w:p>
+            <w:pPr>
+              <w:spacing w:before="0" w:after="0" w:line="240" w:lineRule="auto"/>
+              <w:jc w:val="left"/>
+            </w:pPr>
+            <w:r/>
+            <w:r>
+              <w:rPr>
+                <w:rFonts w:ascii="Times New Roman" w:hAnsi="Times New Roman" w:eastAsia="Times New Roman"/>
+                <w:b w:val="0"/>
+                <w:sz w:val="20"/>
+              </w:rPr>
+              <w:t>Servidor DNS</w:t>
+            </w:r>
+          </w:p>
+        </w:tc>
+        <w:tc>
+          <w:tcPr>
+            <w:tcW w:type="dxa" w:w="5328"/>
+            <w:vAlign w:val="center"/>
+          </w:tcPr>
+          <w:p>
+            <w:pPr>
+              <w:spacing w:before="0" w:after="0" w:line="240" w:lineRule="auto"/>
+              <w:jc w:val="left"/>
+            </w:pPr>
+            <w:r/>
+            <w:r>
+              <w:rPr>
+                <w:rFonts w:ascii="Times New Roman" w:hAnsi="Times New Roman" w:eastAsia="Times New Roman"/>
+                <w:b w:val="0"/>
+                <w:sz w:val="20"/>
+              </w:rPr>
+              <w:t>192.168.3.2</w:t>
+            </w:r>
+          </w:p>
+        </w:tc>
+      </w:tr>
+      <w:tr>
+        <w:tc>
+          <w:tcPr>
+            <w:tcW w:type="dxa" w:w="3312"/>
+            <w:vAlign w:val="center"/>
+          </w:tcPr>
+          <w:p>
+            <w:pPr>
+              <w:spacing w:before="0" w:after="0" w:line="240" w:lineRule="auto"/>
+              <w:jc w:val="left"/>
+            </w:pPr>
+            <w:r/>
+            <w:r>
+              <w:rPr>
+                <w:rFonts w:ascii="Times New Roman" w:hAnsi="Times New Roman" w:eastAsia="Times New Roman"/>
+                <w:b w:val="0"/>
+                <w:sz w:val="20"/>
+              </w:rPr>
+              <w:t>Nombre de dominio</w:t>
+            </w:r>
+          </w:p>
+        </w:tc>
+        <w:tc>
+          <w:tcPr>
+            <w:tcW w:type="dxa" w:w="5328"/>
+            <w:vAlign w:val="center"/>
+          </w:tcPr>
+          <w:p>
+            <w:pPr>
+              <w:spacing w:before="0" w:after="0" w:line="240" w:lineRule="auto"/>
+              <w:jc w:val="left"/>
+            </w:pPr>
+            <w:r/>
+            <w:r>
+              <w:rPr>
+                <w:rFonts w:ascii="Times New Roman" w:hAnsi="Times New Roman" w:eastAsia="Times New Roman"/>
+                <w:b w:val="0"/>
+                <w:sz w:val="20"/>
+              </w:rPr>
+              <w:t>redesi.test</w:t>
+            </w:r>
+          </w:p>
+        </w:tc>
+      </w:tr>
+      <w:tr>
+        <w:tc>
+          <w:tcPr>
+            <w:tcW w:type="dxa" w:w="3312"/>
+            <w:vAlign w:val="center"/>
+          </w:tcPr>
+          <w:p>
+            <w:pPr>
+              <w:spacing w:before="0" w:after="0" w:line="240" w:lineRule="auto"/>
+              <w:jc w:val="left"/>
+            </w:pPr>
+            <w:r/>
+            <w:r>
+              <w:rPr>
+                <w:rFonts w:ascii="Times New Roman" w:hAnsi="Times New Roman" w:eastAsia="Times New Roman"/>
+                <w:b w:val="0"/>
+                <w:sz w:val="20"/>
+              </w:rPr>
+              <w:t>Pool dinámico</w:t>
+            </w:r>
+          </w:p>
+        </w:tc>
+        <w:tc>
+          <w:tcPr>
+            <w:tcW w:type="dxa" w:w="5328"/>
+            <w:vAlign w:val="center"/>
+          </w:tcPr>
+          <w:p>
+            <w:pPr>
+              <w:spacing w:before="0" w:after="0" w:line="240" w:lineRule="auto"/>
+              <w:jc w:val="left"/>
+            </w:pPr>
+            <w:r/>
+            <w:r>
+              <w:rPr>
+                <w:rFonts w:ascii="Times New Roman" w:hAnsi="Times New Roman" w:eastAsia="Times New Roman"/>
+                <w:b w:val="0"/>
+                <w:sz w:val="20"/>
+              </w:rPr>
+              <w:t>192.168.1.100 – 192.168.1.150</w:t>
+            </w:r>
+          </w:p>
+        </w:tc>
+      </w:tr>
+      <w:tr>
+        <w:tc>
+          <w:tcPr>
+            <w:tcW w:type="dxa" w:w="3312"/>
+            <w:vAlign w:val="center"/>
+          </w:tcPr>
+          <w:p>
+            <w:pPr>
+              <w:spacing w:before="0" w:after="0" w:line="240" w:lineRule="auto"/>
+              <w:jc w:val="left"/>
+            </w:pPr>
+            <w:r/>
+            <w:r>
+              <w:rPr>
+                <w:rFonts w:ascii="Times New Roman" w:hAnsi="Times New Roman" w:eastAsia="Times New Roman"/>
+                <w:b w:val="0"/>
+                <w:sz w:val="20"/>
+              </w:rPr>
+              <w:t>Reserva cliente1</w:t>
+            </w:r>
+          </w:p>
+        </w:tc>
+        <w:tc>
+          <w:tcPr>
+            <w:tcW w:type="dxa" w:w="5328"/>
+            <w:vAlign w:val="center"/>
+          </w:tcPr>
+          <w:p>
+            <w:pPr>
+              <w:spacing w:before="0" w:after="0" w:line="240" w:lineRule="auto"/>
+              <w:jc w:val="left"/>
+            </w:pPr>
+            <w:r/>
+            <w:r>
+              <w:rPr>
+                <w:rFonts w:ascii="Times New Roman" w:hAnsi="Times New Roman" w:eastAsia="Times New Roman"/>
+                <w:b w:val="0"/>
+                <w:sz w:val="20"/>
+              </w:rPr>
+              <w:t>192.168.1.2</w:t>
+            </w:r>
+          </w:p>
+        </w:tc>
+      </w:tr>
+      <w:tr>
+        <w:tc>
+          <w:tcPr>
+            <w:tcW w:type="dxa" w:w="3312"/>
+            <w:vAlign w:val="center"/>
+          </w:tcPr>
+          <w:p>
+            <w:pPr>
+              <w:spacing w:before="0" w:after="0" w:line="240" w:lineRule="auto"/>
+              <w:jc w:val="left"/>
+            </w:pPr>
+            <w:r/>
+            <w:r>
+              <w:rPr>
+                <w:rFonts w:ascii="Times New Roman" w:hAnsi="Times New Roman" w:eastAsia="Times New Roman"/>
+                <w:b w:val="0"/>
+                <w:sz w:val="20"/>
+              </w:rPr>
+              <w:t>Reserva cliente2</w:t>
+            </w:r>
+          </w:p>
+        </w:tc>
+        <w:tc>
+          <w:tcPr>
+            <w:tcW w:type="dxa" w:w="5328"/>
+            <w:vAlign w:val="center"/>
+          </w:tcPr>
+          <w:p>
+            <w:pPr>
+              <w:spacing w:before="0" w:after="0" w:line="240" w:lineRule="auto"/>
+              <w:jc w:val="left"/>
+            </w:pPr>
+            <w:r/>
+            <w:r>
+              <w:rPr>
+                <w:rFonts w:ascii="Times New Roman" w:hAnsi="Times New Roman" w:eastAsia="Times New Roman"/>
+                <w:b w:val="0"/>
+                <w:sz w:val="20"/>
+              </w:rPr>
+              <w:t>192.168.1.3</w:t>
+            </w:r>
+          </w:p>
+        </w:tc>
+      </w:tr>
+      <w:tr>
+        <w:tc>
+          <w:tcPr>
+            <w:tcW w:type="dxa" w:w="3312"/>
+            <w:vAlign w:val="center"/>
+          </w:tcPr>
+          <w:p>
+            <w:pPr>
+              <w:spacing w:before="0" w:after="0" w:line="240" w:lineRule="auto"/>
+              <w:jc w:val="left"/>
+            </w:pPr>
+            <w:r/>
+            <w:r>
+              <w:rPr>
+                <w:rFonts w:ascii="Times New Roman" w:hAnsi="Times New Roman" w:eastAsia="Times New Roman"/>
+                <w:b w:val="0"/>
+                <w:sz w:val="20"/>
+              </w:rPr>
+              <w:t>Servidor DHCP</w:t>
+            </w:r>
+          </w:p>
+        </w:tc>
+        <w:tc>
+          <w:tcPr>
+            <w:tcW w:type="dxa" w:w="5328"/>
+            <w:vAlign w:val="center"/>
+          </w:tcPr>
+          <w:p>
+            <w:pPr>
+              <w:spacing w:before="0" w:after="0" w:line="240" w:lineRule="auto"/>
+              <w:jc w:val="left"/>
+            </w:pPr>
+            <w:r/>
+            <w:r>
+              <w:rPr>
+                <w:rFonts w:ascii="Times New Roman" w:hAnsi="Times New Roman" w:eastAsia="Times New Roman"/>
+                <w:b w:val="0"/>
+                <w:sz w:val="20"/>
+              </w:rPr>
+              <w:t>dc1.redesi.test / 192.168.3.2</w:t>
+            </w:r>
+          </w:p>
+        </w:tc>
+      </w:tr>
+      <w:tr>
+        <w:tc>
+          <w:tcPr>
+            <w:tcW w:type="dxa" w:w="3312"/>
+            <w:vAlign w:val="center"/>
+          </w:tcPr>
+          <w:p>
+            <w:pPr>
+              <w:spacing w:before="0" w:after="0" w:line="240" w:lineRule="auto"/>
+              <w:jc w:val="left"/>
+            </w:pPr>
+            <w:r/>
+            <w:r>
+              <w:rPr>
+                <w:rFonts w:ascii="Times New Roman" w:hAnsi="Times New Roman" w:eastAsia="Times New Roman"/>
+                <w:b w:val="0"/>
+                <w:sz w:val="20"/>
+              </w:rPr>
+              <w:t>DHCP Relay</w:t>
+            </w:r>
+          </w:p>
+        </w:tc>
+        <w:tc>
+          <w:tcPr>
+            <w:tcW w:type="dxa" w:w="5328"/>
+            <w:vAlign w:val="center"/>
+          </w:tcPr>
+          <w:p>
+            <w:pPr>
+              <w:spacing w:before="0" w:after="0" w:line="240" w:lineRule="auto"/>
+              <w:jc w:val="left"/>
+            </w:pPr>
+            <w:r/>
+            <w:r>
+              <w:rPr>
+                <w:rFonts w:ascii="Times New Roman" w:hAnsi="Times New Roman" w:eastAsia="Times New Roman"/>
+                <w:b w:val="0"/>
+                <w:sz w:val="20"/>
+              </w:rPr>
+              <w:t>R1 Fa0/0 → 192.168.3.2</w:t>
+            </w:r>
+          </w:p>
+        </w:tc>
+      </w:tr>
+    </w:tbl>
+    <w:p>
+      <w:pPr>
+        <w:spacing w:after="40"/>
+      </w:pPr>
+    </w:p>
+    <w:p>
+      <w:pPr>
+        <w:keepNext/>
+        <w:spacing w:line="480" w:lineRule="auto" w:before="160" w:after="80"/>
+        <w:ind w:firstLine="0"/>
+        <w:jc w:val="left"/>
+      </w:pPr>
+      <w:r>
+        <w:rPr>
+          <w:rFonts w:ascii="Times New Roman" w:hAnsi="Times New Roman" w:eastAsia="Times New Roman"/>
+          <w:b/>
+          <w:sz w:val="24"/>
+        </w:rPr>
+        <w:t>8.1 Identificación de los clientes para reservas DHCP</w:t>
+      </w:r>
+    </w:p>
+    <w:p>
+      <w:pPr>
+        <w:spacing w:line="480" w:lineRule="auto" w:before="0" w:after="0"/>
+        <w:ind w:firstLine="720"/>
+        <w:jc w:val="left"/>
+      </w:pPr>
+      <w:r>
+        <w:rPr>
+          <w:rFonts w:ascii="Times New Roman" w:hAnsi="Times New Roman" w:eastAsia="Times New Roman"/>
+          <w:sz w:val="24"/>
+        </w:rPr>
+        <w:t>Se obtuvieron directamente las direcciones MAC de las interfaces enp2s0 de ambos clientes. Estas direcciones se utilizarán para conservar las IP 192.168.1.2 y 192.168.1.3 mediante reservas DHCP, mientras que el resto del rango dinámico quedará disponible para equipos adicionales.</w:t>
+      </w:r>
+    </w:p>
+    <w:tbl>
+      <w:tblPr>
+        <w:tblW w:type="auto" w:w="0"/>
+        <w:jc w:val="center"/>
+        <w:tblLook w:firstColumn="1" w:firstRow="1" w:lastColumn="0" w:lastRow="0" w:noHBand="0" w:noVBand="1" w:val="04A0"/>
+        <w:tblBorders>
+          <w:top w:val="single" w:sz="4" w:space="0" w:color="000000"/>
+          <w:left w:val="single" w:sz="4" w:space="0" w:color="000000"/>
+          <w:bottom w:val="single" w:sz="4" w:space="0" w:color="000000"/>
+          <w:right w:val="single" w:sz="4" w:space="0" w:color="000000"/>
+          <w:insideH w:val="single" w:sz="4" w:space="0" w:color="000000"/>
+          <w:insideV w:val="single" w:sz="4" w:space="0" w:color="000000"/>
+        </w:tblBorders>
+      </w:tblPr>
+      <w:tblGrid>
+        <w:gridCol w:w="3120"/>
+        <w:gridCol w:w="3120"/>
+        <w:gridCol w:w="3120"/>
+      </w:tblGrid>
+      <w:tr>
+        <w:tc>
+          <w:tcPr>
+            <w:tcW w:type="dxa" w:w="3168"/>
+            <w:vAlign w:val="center"/>
+            <w:shd w:fill="B4C6E7"/>
+          </w:tcPr>
+          <w:p>
+            <w:pPr>
+              <w:spacing w:before="0" w:after="0" w:line="240" w:lineRule="auto"/>
+              <w:jc w:val="center"/>
+            </w:pPr>
+            <w:r/>
+            <w:r>
+              <w:rPr>
+                <w:rFonts w:ascii="Times New Roman" w:hAnsi="Times New Roman" w:eastAsia="Times New Roman"/>
+                <w:b/>
+                <w:sz w:val="20"/>
+              </w:rPr>
+              <w:t>Equipo</w:t>
+            </w:r>
+          </w:p>
+        </w:tc>
+        <w:tc>
+          <w:tcPr>
+            <w:tcW w:type="dxa" w:w="3024"/>
+            <w:vAlign w:val="center"/>
+            <w:shd w:fill="B4C6E7"/>
+          </w:tcPr>
+          <w:p>
+            <w:pPr>
+              <w:spacing w:before="0" w:after="0" w:line="240" w:lineRule="auto"/>
+              <w:jc w:val="center"/>
+            </w:pPr>
+            <w:r/>
+            <w:r>
+              <w:rPr>
+                <w:rFonts w:ascii="Times New Roman" w:hAnsi="Times New Roman" w:eastAsia="Times New Roman"/>
+                <w:b/>
+                <w:sz w:val="20"/>
+              </w:rPr>
+              <w:t>MAC</w:t>
+            </w:r>
+          </w:p>
+        </w:tc>
+        <w:tc>
+          <w:tcPr>
+            <w:tcW w:type="dxa" w:w="2448"/>
+            <w:vAlign w:val="center"/>
+            <w:shd w:fill="B4C6E7"/>
+          </w:tcPr>
+          <w:p>
+            <w:pPr>
+              <w:spacing w:before="0" w:after="0" w:line="240" w:lineRule="auto"/>
+              <w:jc w:val="center"/>
+            </w:pPr>
+            <w:r/>
+            <w:r>
+              <w:rPr>
+                <w:rFonts w:ascii="Times New Roman" w:hAnsi="Times New Roman" w:eastAsia="Times New Roman"/>
+                <w:b/>
+                <w:sz w:val="20"/>
+              </w:rPr>
+              <w:t>Dirección reservada</w:t>
+            </w:r>
+          </w:p>
+        </w:tc>
+      </w:tr>
+      <w:tr>
+        <w:tc>
+          <w:tcPr>
+            <w:tcW w:type="dxa" w:w="3168"/>
+            <w:vAlign w:val="center"/>
+          </w:tcPr>
+          <w:p>
+            <w:pPr>
+              <w:spacing w:before="0" w:after="0" w:line="240" w:lineRule="auto"/>
+              <w:jc w:val="left"/>
+            </w:pPr>
+            <w:r/>
+            <w:r>
+              <w:rPr>
+                <w:rFonts w:ascii="Times New Roman" w:hAnsi="Times New Roman" w:eastAsia="Times New Roman"/>
+                <w:b w:val="0"/>
+                <w:sz w:val="20"/>
+              </w:rPr>
+              <w:t>cliente1.redesi.test</w:t>
+            </w:r>
+          </w:p>
+        </w:tc>
+        <w:tc>
+          <w:tcPr>
+            <w:tcW w:type="dxa" w:w="3024"/>
+            <w:vAlign w:val="center"/>
+          </w:tcPr>
+          <w:p>
+            <w:pPr>
+              <w:spacing w:before="0" w:after="0" w:line="240" w:lineRule="auto"/>
+              <w:jc w:val="left"/>
+            </w:pPr>
+            <w:r/>
+            <w:r>
+              <w:rPr>
+                <w:rFonts w:ascii="Times New Roman" w:hAnsi="Times New Roman" w:eastAsia="Times New Roman"/>
+                <w:b w:val="0"/>
+                <w:sz w:val="20"/>
+              </w:rPr>
+              <w:t>0c:97:89:3b:00:00</w:t>
+            </w:r>
+          </w:p>
+        </w:tc>
+        <w:tc>
+          <w:tcPr>
+            <w:tcW w:type="dxa" w:w="2448"/>
+            <w:vAlign w:val="center"/>
+          </w:tcPr>
+          <w:p>
+            <w:pPr>
+              <w:spacing w:before="0" w:after="0" w:line="240" w:lineRule="auto"/>
+              <w:jc w:val="left"/>
+            </w:pPr>
+            <w:r/>
+            <w:r>
+              <w:rPr>
+                <w:rFonts w:ascii="Times New Roman" w:hAnsi="Times New Roman" w:eastAsia="Times New Roman"/>
+                <w:b w:val="0"/>
+                <w:sz w:val="20"/>
+              </w:rPr>
+              <w:t>192.168.1.2</w:t>
+            </w:r>
+          </w:p>
+        </w:tc>
+      </w:tr>
+      <w:tr>
+        <w:tc>
+          <w:tcPr>
+            <w:tcW w:type="dxa" w:w="3168"/>
+            <w:vAlign w:val="center"/>
+          </w:tcPr>
+          <w:p>
+            <w:pPr>
+              <w:spacing w:before="0" w:after="0" w:line="240" w:lineRule="auto"/>
+              <w:jc w:val="left"/>
+            </w:pPr>
+            <w:r/>
+            <w:r>
+              <w:rPr>
+                <w:rFonts w:ascii="Times New Roman" w:hAnsi="Times New Roman" w:eastAsia="Times New Roman"/>
+                <w:b w:val="0"/>
+                <w:sz w:val="20"/>
+              </w:rPr>
+              <w:t>cliente2.redesi.test</w:t>
+            </w:r>
+          </w:p>
+        </w:tc>
+        <w:tc>
+          <w:tcPr>
+            <w:tcW w:type="dxa" w:w="3024"/>
+            <w:vAlign w:val="center"/>
+          </w:tcPr>
+          <w:p>
+            <w:pPr>
+              <w:spacing w:before="0" w:after="0" w:line="240" w:lineRule="auto"/>
+              <w:jc w:val="left"/>
+            </w:pPr>
+            <w:r/>
+            <w:r>
+              <w:rPr>
+                <w:rFonts w:ascii="Times New Roman" w:hAnsi="Times New Roman" w:eastAsia="Times New Roman"/>
+                <w:b w:val="0"/>
+                <w:sz w:val="20"/>
+              </w:rPr>
+              <w:t>0c:01:6e:2b:00:00</w:t>
+            </w:r>
+          </w:p>
+        </w:tc>
+        <w:tc>
+          <w:tcPr>
+            <w:tcW w:type="dxa" w:w="2448"/>
+            <w:vAlign w:val="center"/>
+          </w:tcPr>
+          <w:p>
+            <w:pPr>
+              <w:spacing w:before="0" w:after="0" w:line="240" w:lineRule="auto"/>
+              <w:jc w:val="left"/>
+            </w:pPr>
+            <w:r/>
+            <w:r>
+              <w:rPr>
+                <w:rFonts w:ascii="Times New Roman" w:hAnsi="Times New Roman" w:eastAsia="Times New Roman"/>
+                <w:b w:val="0"/>
+                <w:sz w:val="20"/>
+              </w:rPr>
+              <w:t>192.168.1.3</w:t>
+            </w:r>
+          </w:p>
+        </w:tc>
+      </w:tr>
+    </w:tbl>
+    <w:p>
+      <w:pPr>
+        <w:spacing w:after="40"/>
+      </w:pPr>
+    </w:p>
+    <w:p>
+      <w:pPr>
+        <w:keepNext/>
+        <w:spacing w:line="240" w:lineRule="auto" w:before="120" w:after="0"/>
+        <w:ind w:firstLine="0"/>
+        <w:jc w:val="left"/>
+      </w:pPr>
+      <w:r>
+        <w:rPr>
+          <w:rFonts w:ascii="Times New Roman" w:hAnsi="Times New Roman" w:eastAsia="Times New Roman"/>
+          <w:b/>
+          <w:sz w:val="24"/>
+        </w:rPr>
+        <w:t>Figura 5</w:t>
+      </w:r>
+    </w:p>
+    <w:p>
+      <w:pPr>
+        <w:keepNext/>
+        <w:spacing w:line="240" w:lineRule="auto" w:before="0" w:after="80"/>
+        <w:ind w:firstLine="0"/>
+        <w:jc w:val="left"/>
+      </w:pPr>
+      <w:r>
+        <w:rPr>
+          <w:rFonts w:ascii="Times New Roman" w:hAnsi="Times New Roman" w:eastAsia="Times New Roman"/>
+          <w:i/>
+          <w:sz w:val="24"/>
+        </w:rPr>
+        <w:t>Direcciones MAC obtenidas de DebianClient1 y DebianClient2.</w:t>
+      </w:r>
+    </w:p>
+    <w:p>
+      <w:pPr>
+        <w:keepNext/>
+        <w:jc w:val="center"/>
+      </w:pPr>
+      <w:r>
+        <w:drawing>
+          <wp:inline>
+            <wp:extent cx="5486400" cy="1666755"/>
+            <wp:docPr id="18" name="Picture 18"/>
+            <wp:cNvGraphicFramePr>
+              <a:graphicFrameLocks noChangeAspect="1"/>
+            </wp:cNvGraphicFramePr>
+            <a:graphic>
+              <a:graphicData uri="http://schemas.openxmlformats.org/drawingml/2006/picture">
+                <pic:pic>
+                  <pic:nvPicPr>
+                    <pic:cNvPr id="0" name="fig17_macs_clientes.png"/>
+                    <pic:cNvPicPr/>
+                  </pic:nvPicPr>
+                  <pic:blipFill>
+                    <a:blip r:embed="rId23"/>
+                    <a:stretch>
+                      <a:fillRect/>
+                    </a:stretch>
+                  </pic:blipFill>
+                  <pic:spPr>
+                    <a:xfrm>
+                      <a:off x="0" y="0"/>
+                      <a:ext cx="5486400" cy="1666755"/>
+                    </a:xfrm>
+                    <a:prstGeom prst="rect"/>
+                  </pic:spPr>
+                </pic:pic>
+              </a:graphicData>
+            </a:graphic>
+          </wp:inline>
+        </w:drawing>
+      </w:r>
+    </w:p>
+    <w:p>
+      <w:pPr>
+        <w:spacing w:line="240" w:lineRule="auto" w:before="40" w:after="120"/>
+        <w:ind w:firstLine="0"/>
+        <w:jc w:val="left"/>
+      </w:pPr>
+      <w:r>
+        <w:rPr>
+          <w:rFonts w:ascii="Times New Roman" w:hAnsi="Times New Roman" w:eastAsia="Times New Roman"/>
+          <w:i/>
+          <w:sz w:val="20"/>
+        </w:rPr>
+        <w:t xml:space="preserve">Nota. </w:t>
+      </w:r>
+      <w:r>
+        <w:rPr>
+          <w:rFonts w:ascii="Times New Roman" w:hAnsi="Times New Roman" w:eastAsia="Times New Roman"/>
+          <w:sz w:val="20"/>
+        </w:rPr>
+        <w:t>Las direcciones fueron consultadas directamente en /sys/class/net/enp2s0/address y serán utilizadas en las reservas del servidor DHCP.</w:t>
+      </w:r>
+    </w:p>
+    <w:p>
+      <w:pPr>
+        <w:keepNext/>
+        <w:spacing w:line="480" w:lineRule="auto" w:before="160" w:after="80"/>
+        <w:ind w:firstLine="0"/>
+        <w:jc w:val="left"/>
+      </w:pPr>
+      <w:r>
+        <w:rPr>
+          <w:rFonts w:ascii="Times New Roman" w:hAnsi="Times New Roman" w:eastAsia="Times New Roman"/>
+          <w:b/>
+          <w:sz w:val="24"/>
+        </w:rPr>
+        <w:t>8.2 Estado actual de la instalación DHCP</w:t>
+      </w:r>
+    </w:p>
+    <w:p>
+      <w:pPr>
+        <w:spacing w:line="480" w:lineRule="auto" w:before="0" w:after="0"/>
+        <w:ind w:firstLine="720"/>
+        <w:jc w:val="left"/>
+      </w:pPr>
+      <w:r>
+        <w:rPr>
+          <w:rFonts w:ascii="Times New Roman" w:hAnsi="Times New Roman" w:eastAsia="Times New Roman"/>
+          <w:sz w:val="24"/>
+        </w:rPr>
+        <w:t>En dc1 se instaló el paquete isc-dhcp-server. Durante la instalación, el servicio no pudo iniciar porque todavía no existía una configuración DHCP completa, comportamiento esperado en esta etapa. Se verificó que ens1 está activa con 192.168.3.2/24 y se configuró INTERFACESv4="ens1" en /etc/default/isc-dhcp-server para que el servicio escuche en la interfaz interna de la LAN de servidores.</w:t>
+      </w:r>
+    </w:p>
+    <w:p>
+      <w:pPr>
+        <w:keepNext/>
+        <w:spacing w:line="240" w:lineRule="auto" w:before="120" w:after="0"/>
+        <w:ind w:firstLine="0"/>
+        <w:jc w:val="left"/>
+      </w:pPr>
+      <w:r>
+        <w:rPr>
+          <w:rFonts w:ascii="Times New Roman" w:hAnsi="Times New Roman" w:eastAsia="Times New Roman"/>
+          <w:b/>
+          <w:sz w:val="24"/>
+        </w:rPr>
+        <w:t>Figura 6</w:t>
+      </w:r>
+    </w:p>
+    <w:p>
+      <w:pPr>
+        <w:keepNext/>
+        <w:spacing w:line="240" w:lineRule="auto" w:before="0" w:after="80"/>
+        <w:ind w:firstLine="0"/>
+        <w:jc w:val="left"/>
+      </w:pPr>
+      <w:r>
+        <w:rPr>
+          <w:rFonts w:ascii="Times New Roman" w:hAnsi="Times New Roman" w:eastAsia="Times New Roman"/>
+          <w:i/>
+          <w:sz w:val="24"/>
+        </w:rPr>
+        <w:t>Preparación del servicio ISC DHCP Server en dc1.</w:t>
+      </w:r>
+    </w:p>
+    <w:p>
+      <w:pPr>
+        <w:keepNext/>
+        <w:jc w:val="center"/>
+      </w:pPr>
+      <w:r>
+        <w:drawing>
+          <wp:inline>
+            <wp:extent cx="5577840" cy="7371421"/>
+            <wp:docPr id="19" name="Picture 19"/>
+            <wp:cNvGraphicFramePr>
+              <a:graphicFrameLocks noChangeAspect="1"/>
+            </wp:cNvGraphicFramePr>
+            <a:graphic>
+              <a:graphicData uri="http://schemas.openxmlformats.org/drawingml/2006/picture">
+                <pic:pic>
+                  <pic:nvPicPr>
+                    <pic:cNvPr id="0" name="fig18_dhcp_preparacion.png"/>
+                    <pic:cNvPicPr/>
+                  </pic:nvPicPr>
+                  <pic:blipFill>
+                    <a:blip r:embed="rId24"/>
+                    <a:stretch>
+                      <a:fillRect/>
+                    </a:stretch>
+                  </pic:blipFill>
+                  <pic:spPr>
+                    <a:xfrm>
+                      <a:off x="0" y="0"/>
+                      <a:ext cx="5577840" cy="7371421"/>
+                    </a:xfrm>
+                    <a:prstGeom prst="rect"/>
+                  </pic:spPr>
+                </pic:pic>
+              </a:graphicData>
+            </a:graphic>
+          </wp:inline>
+        </w:drawing>
+      </w:r>
+    </w:p>
+    <w:p>
+      <w:pPr>
+        <w:spacing w:line="240" w:lineRule="auto" w:before="40" w:after="120"/>
+        <w:ind w:firstLine="0"/>
+        <w:jc w:val="left"/>
+      </w:pPr>
+      <w:r>
+        <w:rPr>
+          <w:rFonts w:ascii="Times New Roman" w:hAnsi="Times New Roman" w:eastAsia="Times New Roman"/>
+          <w:i/>
+          <w:sz w:val="20"/>
+        </w:rPr>
+        <w:t xml:space="preserve">Nota. </w:t>
+      </w:r>
+      <w:r>
+        <w:rPr>
+          <w:rFonts w:ascii="Times New Roman" w:hAnsi="Times New Roman" w:eastAsia="Times New Roman"/>
+          <w:sz w:val="20"/>
+        </w:rPr>
+        <w:t>La evidencia muestra la instalación del paquete, el fallo inicial del servicio antes de completar dhcpd.conf, la IP 192.168.3.2/24 en ens1 y la selección de ens1 como interfaz IPv4 del servicio.</w:t>
+      </w:r>
+    </w:p>
+    <w:p>
+      <w:pPr>
+        <w:spacing w:line="480" w:lineRule="auto" w:before="0" w:after="0"/>
+        <w:ind w:firstLine="720"/>
+        <w:jc w:val="left"/>
+      </w:pPr>
+      <w:r>
+        <w:rPr>
+          <w:rFonts w:ascii="Times New Roman" w:hAnsi="Times New Roman" w:eastAsia="Times New Roman"/>
+          <w:sz w:val="24"/>
+        </w:rPr>
+        <w:t>Al cierre de esta actualización, DHCP se encuentra en implementación. Aún debe completarse /etc/dhcp/dhcpd.conf con el pool y las reservas, validar la sintaxis con dhcpd -t, iniciar el servicio, agregar ip helper-address 192.168.3.2 en FastEthernet0/0 de R1 y cambiar los clientes de direccionamiento manual a automático para ejecutar la prueba final. Por esta razón, el servicio no se marca todavía como completado.</w:t>
+      </w:r>
+    </w:p>
+    <w:p>
+      <w:pPr>
+        <w:keepNext/>
+        <w:spacing w:line="480" w:lineRule="auto" w:before="160" w:after="80"/>
+        <w:ind w:firstLine="0"/>
+        <w:jc w:val="left"/>
+      </w:pPr>
+      <w:r>
+        <w:rPr>
+          <w:rFonts w:ascii="Times New Roman" w:hAnsi="Times New Roman" w:eastAsia="Times New Roman"/>
+          <w:b/>
+          <w:sz w:val="24"/>
+        </w:rPr>
+        <w:t>9. Estado consolidado del proyecto</w:t>
+      </w:r>
+    </w:p>
+    <w:tbl>
+      <w:tblPr>
+        <w:tblW w:type="auto" w:w="0"/>
+        <w:jc w:val="center"/>
+        <w:tblLook w:firstColumn="1" w:firstRow="1" w:lastColumn="0" w:lastRow="0" w:noHBand="0" w:noVBand="1" w:val="04A0"/>
+        <w:tblBorders>
+          <w:top w:val="single" w:sz="4" w:space="0" w:color="000000"/>
+          <w:left w:val="single" w:sz="4" w:space="0" w:color="000000"/>
+          <w:bottom w:val="single" w:sz="4" w:space="0" w:color="000000"/>
+          <w:right w:val="single" w:sz="4" w:space="0" w:color="000000"/>
+          <w:insideH w:val="single" w:sz="4" w:space="0" w:color="000000"/>
+          <w:insideV w:val="single" w:sz="4" w:space="0" w:color="000000"/>
+        </w:tblBorders>
+      </w:tblPr>
+      <w:tblGrid>
+        <w:gridCol w:w="3120"/>
+        <w:gridCol w:w="3120"/>
+        <w:gridCol w:w="3120"/>
+      </w:tblGrid>
+      <w:tr>
+        <w:tc>
+          <w:tcPr>
+            <w:tcW w:type="dxa" w:w="3384"/>
+            <w:vAlign w:val="center"/>
+            <w:shd w:fill="B4C6E7"/>
+          </w:tcPr>
+          <w:p>
+            <w:pPr>
+              <w:spacing w:before="0" w:after="0" w:line="240" w:lineRule="auto"/>
+              <w:jc w:val="center"/>
+            </w:pPr>
+            <w:r/>
+            <w:r>
+              <w:rPr>
+                <w:rFonts w:ascii="Times New Roman" w:hAnsi="Times New Roman" w:eastAsia="Times New Roman"/>
+                <w:b/>
+                <w:sz w:val="20"/>
+              </w:rPr>
+              <w:t>Componente / requerimiento</w:t>
+            </w:r>
+          </w:p>
+        </w:tc>
+        <w:tc>
+          <w:tcPr>
+            <w:tcW w:type="dxa" w:w="1656"/>
+            <w:vAlign w:val="center"/>
+            <w:shd w:fill="B4C6E7"/>
+          </w:tcPr>
+          <w:p>
+            <w:pPr>
+              <w:spacing w:before="0" w:after="0" w:line="240" w:lineRule="auto"/>
+              <w:jc w:val="center"/>
+            </w:pPr>
+            <w:r/>
+            <w:r>
+              <w:rPr>
+                <w:rFonts w:ascii="Times New Roman" w:hAnsi="Times New Roman" w:eastAsia="Times New Roman"/>
+                <w:b/>
+                <w:sz w:val="20"/>
+              </w:rPr>
+              <w:t>Estado</w:t>
+            </w:r>
+          </w:p>
+        </w:tc>
+        <w:tc>
+          <w:tcPr>
+            <w:tcW w:type="dxa" w:w="3600"/>
+            <w:vAlign w:val="center"/>
+            <w:shd w:fill="B4C6E7"/>
+          </w:tcPr>
+          <w:p>
+            <w:pPr>
+              <w:spacing w:before="0" w:after="0" w:line="240" w:lineRule="auto"/>
+              <w:jc w:val="center"/>
+            </w:pPr>
+            <w:r/>
+            <w:r>
+              <w:rPr>
+                <w:rFonts w:ascii="Times New Roman" w:hAnsi="Times New Roman" w:eastAsia="Times New Roman"/>
+                <w:b/>
+                <w:sz w:val="20"/>
+              </w:rPr>
+              <w:t>Observación</w:t>
+            </w:r>
+          </w:p>
+        </w:tc>
+      </w:tr>
+      <w:tr>
+        <w:tc>
+          <w:tcPr>
+            <w:tcW w:type="dxa" w:w="3384"/>
+            <w:vAlign w:val="center"/>
+          </w:tcPr>
+          <w:p>
+            <w:pPr>
+              <w:spacing w:before="0" w:after="0" w:line="240" w:lineRule="auto"/>
+              <w:jc w:val="left"/>
+            </w:pPr>
+            <w:r/>
+            <w:r>
+              <w:rPr>
+                <w:rFonts w:ascii="Times New Roman" w:hAnsi="Times New Roman" w:eastAsia="Times New Roman"/>
+                <w:b w:val="0"/>
+                <w:sz w:val="20"/>
+              </w:rPr>
+              <w:t>Topología GNS3 y direccionamiento</w:t>
+            </w:r>
+          </w:p>
+        </w:tc>
+        <w:tc>
+          <w:tcPr>
+            <w:tcW w:type="dxa" w:w="1656"/>
+            <w:vAlign w:val="center"/>
+          </w:tcPr>
+          <w:p>
+            <w:pPr>
+              <w:spacing w:before="0" w:after="0" w:line="240" w:lineRule="auto"/>
+              <w:jc w:val="left"/>
+            </w:pPr>
+            <w:r/>
+            <w:r>
+              <w:rPr>
+                <w:rFonts w:ascii="Times New Roman" w:hAnsi="Times New Roman" w:eastAsia="Times New Roman"/>
+                <w:b w:val="0"/>
+                <w:sz w:val="20"/>
+              </w:rPr>
+              <w:t>Completado</w:t>
+            </w:r>
+          </w:p>
+        </w:tc>
+        <w:tc>
+          <w:tcPr>
+            <w:tcW w:type="dxa" w:w="3600"/>
+            <w:vAlign w:val="center"/>
+          </w:tcPr>
+          <w:p>
+            <w:pPr>
+              <w:spacing w:before="0" w:after="0" w:line="240" w:lineRule="auto"/>
+              <w:jc w:val="left"/>
+            </w:pPr>
+            <w:r/>
+            <w:r>
+              <w:rPr>
+                <w:rFonts w:ascii="Times New Roman" w:hAnsi="Times New Roman" w:eastAsia="Times New Roman"/>
+                <w:b w:val="0"/>
+                <w:sz w:val="20"/>
+              </w:rPr>
+              <w:t>Tres redes IPv4 y equipos actuales documentados.</w:t>
+            </w:r>
+          </w:p>
+        </w:tc>
+      </w:tr>
+      <w:tr>
+        <w:tc>
+          <w:tcPr>
+            <w:tcW w:type="dxa" w:w="3384"/>
+            <w:vAlign w:val="center"/>
+          </w:tcPr>
+          <w:p>
+            <w:pPr>
+              <w:spacing w:before="0" w:after="0" w:line="240" w:lineRule="auto"/>
+              <w:jc w:val="left"/>
+            </w:pPr>
+            <w:r/>
+            <w:r>
+              <w:rPr>
+                <w:rFonts w:ascii="Times New Roman" w:hAnsi="Times New Roman" w:eastAsia="Times New Roman"/>
+                <w:b w:val="0"/>
+                <w:sz w:val="20"/>
+              </w:rPr>
+              <w:t>Enrutamiento R1/R2</w:t>
+            </w:r>
+          </w:p>
+        </w:tc>
+        <w:tc>
+          <w:tcPr>
+            <w:tcW w:type="dxa" w:w="1656"/>
+            <w:vAlign w:val="center"/>
+          </w:tcPr>
+          <w:p>
+            <w:pPr>
+              <w:spacing w:before="0" w:after="0" w:line="240" w:lineRule="auto"/>
+              <w:jc w:val="left"/>
+            </w:pPr>
+            <w:r/>
+            <w:r>
+              <w:rPr>
+                <w:rFonts w:ascii="Times New Roman" w:hAnsi="Times New Roman" w:eastAsia="Times New Roman"/>
+                <w:b w:val="0"/>
+                <w:sz w:val="20"/>
+              </w:rPr>
+              <w:t>Completado</w:t>
+            </w:r>
+          </w:p>
+        </w:tc>
+        <w:tc>
+          <w:tcPr>
+            <w:tcW w:type="dxa" w:w="3600"/>
+            <w:vAlign w:val="center"/>
+          </w:tcPr>
+          <w:p>
+            <w:pPr>
+              <w:spacing w:before="0" w:after="0" w:line="240" w:lineRule="auto"/>
+              <w:jc w:val="left"/>
+            </w:pPr>
+            <w:r/>
+            <w:r>
+              <w:rPr>
+                <w:rFonts w:ascii="Times New Roman" w:hAnsi="Times New Roman" w:eastAsia="Times New Roman"/>
+                <w:b w:val="0"/>
+                <w:sz w:val="20"/>
+              </w:rPr>
+              <w:t>Conectividad entre LAN de clientes y LAN de servidores.</w:t>
+            </w:r>
+          </w:p>
+        </w:tc>
+      </w:tr>
+      <w:tr>
+        <w:tc>
+          <w:tcPr>
+            <w:tcW w:type="dxa" w:w="3384"/>
+            <w:vAlign w:val="center"/>
+          </w:tcPr>
+          <w:p>
+            <w:pPr>
+              <w:spacing w:before="0" w:after="0" w:line="240" w:lineRule="auto"/>
+              <w:jc w:val="left"/>
+            </w:pPr>
+            <w:r/>
+            <w:r>
+              <w:rPr>
+                <w:rFonts w:ascii="Times New Roman" w:hAnsi="Times New Roman" w:eastAsia="Times New Roman"/>
+                <w:b w:val="0"/>
+                <w:sz w:val="20"/>
+              </w:rPr>
+              <w:t>Salida a Internet por NAT1</w:t>
+            </w:r>
+          </w:p>
+        </w:tc>
+        <w:tc>
+          <w:tcPr>
+            <w:tcW w:type="dxa" w:w="1656"/>
+            <w:vAlign w:val="center"/>
+          </w:tcPr>
+          <w:p>
+            <w:pPr>
+              <w:spacing w:before="0" w:after="0" w:line="240" w:lineRule="auto"/>
+              <w:jc w:val="left"/>
+            </w:pPr>
+            <w:r/>
+            <w:r>
+              <w:rPr>
+                <w:rFonts w:ascii="Times New Roman" w:hAnsi="Times New Roman" w:eastAsia="Times New Roman"/>
+                <w:b w:val="0"/>
+                <w:sz w:val="20"/>
+              </w:rPr>
+              <w:t>Completado</w:t>
+            </w:r>
+          </w:p>
+        </w:tc>
+        <w:tc>
+          <w:tcPr>
+            <w:tcW w:type="dxa" w:w="3600"/>
+            <w:vAlign w:val="center"/>
+          </w:tcPr>
+          <w:p>
+            <w:pPr>
+              <w:spacing w:before="0" w:after="0" w:line="240" w:lineRule="auto"/>
+              <w:jc w:val="left"/>
+            </w:pPr>
+            <w:r/>
+            <w:r>
+              <w:rPr>
+                <w:rFonts w:ascii="Times New Roman" w:hAnsi="Times New Roman" w:eastAsia="Times New Roman"/>
+                <w:b w:val="0"/>
+                <w:sz w:val="20"/>
+              </w:rPr>
+              <w:t>R1 centraliza PAT para las redes internas.</w:t>
+            </w:r>
+          </w:p>
+        </w:tc>
+      </w:tr>
+      <w:tr>
+        <w:tc>
+          <w:tcPr>
+            <w:tcW w:type="dxa" w:w="3384"/>
+            <w:vAlign w:val="center"/>
+          </w:tcPr>
+          <w:p>
+            <w:pPr>
+              <w:spacing w:before="0" w:after="0" w:line="240" w:lineRule="auto"/>
+              <w:jc w:val="left"/>
+            </w:pPr>
+            <w:r/>
+            <w:r>
+              <w:rPr>
+                <w:rFonts w:ascii="Times New Roman" w:hAnsi="Times New Roman" w:eastAsia="Times New Roman"/>
+                <w:b w:val="0"/>
+                <w:sz w:val="20"/>
+              </w:rPr>
+              <w:t>Controlador de dominio Samba AD</w:t>
+            </w:r>
+          </w:p>
+        </w:tc>
+        <w:tc>
+          <w:tcPr>
+            <w:tcW w:type="dxa" w:w="1656"/>
+            <w:vAlign w:val="center"/>
+          </w:tcPr>
+          <w:p>
+            <w:pPr>
+              <w:spacing w:before="0" w:after="0" w:line="240" w:lineRule="auto"/>
+              <w:jc w:val="left"/>
+            </w:pPr>
+            <w:r/>
+            <w:r>
+              <w:rPr>
+                <w:rFonts w:ascii="Times New Roman" w:hAnsi="Times New Roman" w:eastAsia="Times New Roman"/>
+                <w:b w:val="0"/>
+                <w:sz w:val="20"/>
+              </w:rPr>
+              <w:t>Completado</w:t>
+            </w:r>
+          </w:p>
+        </w:tc>
+        <w:tc>
+          <w:tcPr>
+            <w:tcW w:type="dxa" w:w="3600"/>
+            <w:vAlign w:val="center"/>
+          </w:tcPr>
+          <w:p>
+            <w:pPr>
+              <w:spacing w:before="0" w:after="0" w:line="240" w:lineRule="auto"/>
+              <w:jc w:val="left"/>
+            </w:pPr>
+            <w:r/>
+            <w:r>
+              <w:rPr>
+                <w:rFonts w:ascii="Times New Roman" w:hAnsi="Times New Roman" w:eastAsia="Times New Roman"/>
+                <w:b w:val="0"/>
+                <w:sz w:val="20"/>
+              </w:rPr>
+              <w:t>dc1.redesi.test operativo.</w:t>
+            </w:r>
+          </w:p>
+        </w:tc>
+      </w:tr>
+      <w:tr>
+        <w:tc>
+          <w:tcPr>
+            <w:tcW w:type="dxa" w:w="3384"/>
+            <w:vAlign w:val="center"/>
+          </w:tcPr>
+          <w:p>
+            <w:pPr>
+              <w:spacing w:before="0" w:after="0" w:line="240" w:lineRule="auto"/>
+              <w:jc w:val="left"/>
+            </w:pPr>
+            <w:r/>
+            <w:r>
+              <w:rPr>
+                <w:rFonts w:ascii="Times New Roman" w:hAnsi="Times New Roman" w:eastAsia="Times New Roman"/>
+                <w:b w:val="0"/>
+                <w:sz w:val="20"/>
+              </w:rPr>
+              <w:t>DNS corporativo</w:t>
+            </w:r>
+          </w:p>
+        </w:tc>
+        <w:tc>
+          <w:tcPr>
+            <w:tcW w:type="dxa" w:w="1656"/>
+            <w:vAlign w:val="center"/>
+          </w:tcPr>
+          <w:p>
+            <w:pPr>
+              <w:spacing w:before="0" w:after="0" w:line="240" w:lineRule="auto"/>
+              <w:jc w:val="left"/>
+            </w:pPr>
+            <w:r/>
+            <w:r>
+              <w:rPr>
+                <w:rFonts w:ascii="Times New Roman" w:hAnsi="Times New Roman" w:eastAsia="Times New Roman"/>
+                <w:b w:val="0"/>
+                <w:sz w:val="20"/>
+              </w:rPr>
+              <w:t>Completado</w:t>
+            </w:r>
+          </w:p>
+        </w:tc>
+        <w:tc>
+          <w:tcPr>
+            <w:tcW w:type="dxa" w:w="3600"/>
+            <w:vAlign w:val="center"/>
+          </w:tcPr>
+          <w:p>
+            <w:pPr>
+              <w:spacing w:before="0" w:after="0" w:line="240" w:lineRule="auto"/>
+              <w:jc w:val="left"/>
+            </w:pPr>
+            <w:r/>
+            <w:r>
+              <w:rPr>
+                <w:rFonts w:ascii="Times New Roman" w:hAnsi="Times New Roman" w:eastAsia="Times New Roman"/>
+                <w:b w:val="0"/>
+                <w:sz w:val="20"/>
+              </w:rPr>
+              <w:t>Resolución interna y reenvío externo funcional.</w:t>
+            </w:r>
+          </w:p>
+        </w:tc>
+      </w:tr>
+      <w:tr>
+        <w:tc>
+          <w:tcPr>
+            <w:tcW w:type="dxa" w:w="3384"/>
+            <w:vAlign w:val="center"/>
+          </w:tcPr>
+          <w:p>
+            <w:pPr>
+              <w:spacing w:before="0" w:after="0" w:line="240" w:lineRule="auto"/>
+              <w:jc w:val="left"/>
+            </w:pPr>
+            <w:r/>
+            <w:r>
+              <w:rPr>
+                <w:rFonts w:ascii="Times New Roman" w:hAnsi="Times New Roman" w:eastAsia="Times New Roman"/>
+                <w:b w:val="0"/>
+                <w:sz w:val="20"/>
+              </w:rPr>
+              <w:t>Kerberos</w:t>
+            </w:r>
+          </w:p>
+        </w:tc>
+        <w:tc>
+          <w:tcPr>
+            <w:tcW w:type="dxa" w:w="1656"/>
+            <w:vAlign w:val="center"/>
+          </w:tcPr>
+          <w:p>
+            <w:pPr>
+              <w:spacing w:before="0" w:after="0" w:line="240" w:lineRule="auto"/>
+              <w:jc w:val="left"/>
+            </w:pPr>
+            <w:r/>
+            <w:r>
+              <w:rPr>
+                <w:rFonts w:ascii="Times New Roman" w:hAnsi="Times New Roman" w:eastAsia="Times New Roman"/>
+                <w:b w:val="0"/>
+                <w:sz w:val="20"/>
+              </w:rPr>
+              <w:t>Completado</w:t>
+            </w:r>
+          </w:p>
+        </w:tc>
+        <w:tc>
+          <w:tcPr>
+            <w:tcW w:type="dxa" w:w="3600"/>
+            <w:vAlign w:val="center"/>
+          </w:tcPr>
+          <w:p>
+            <w:pPr>
+              <w:spacing w:before="0" w:after="0" w:line="240" w:lineRule="auto"/>
+              <w:jc w:val="left"/>
+            </w:pPr>
+            <w:r/>
+            <w:r>
+              <w:rPr>
+                <w:rFonts w:ascii="Times New Roman" w:hAnsi="Times New Roman" w:eastAsia="Times New Roman"/>
+                <w:b w:val="0"/>
+                <w:sz w:val="20"/>
+              </w:rPr>
+              <w:t>Tickets válidos para usuarios del dominio.</w:t>
+            </w:r>
+          </w:p>
+        </w:tc>
+      </w:tr>
+      <w:tr>
+        <w:tc>
+          <w:tcPr>
+            <w:tcW w:type="dxa" w:w="3384"/>
+            <w:vAlign w:val="center"/>
+          </w:tcPr>
+          <w:p>
+            <w:pPr>
+              <w:spacing w:before="0" w:after="0" w:line="240" w:lineRule="auto"/>
+              <w:jc w:val="left"/>
+            </w:pPr>
+            <w:r/>
+            <w:r>
+              <w:rPr>
+                <w:rFonts w:ascii="Times New Roman" w:hAnsi="Times New Roman" w:eastAsia="Times New Roman"/>
+                <w:b w:val="0"/>
+                <w:sz w:val="20"/>
+              </w:rPr>
+              <w:t>cliente1 unido al dominio</w:t>
+            </w:r>
+          </w:p>
+        </w:tc>
+        <w:tc>
+          <w:tcPr>
+            <w:tcW w:type="dxa" w:w="1656"/>
+            <w:vAlign w:val="center"/>
+          </w:tcPr>
+          <w:p>
+            <w:pPr>
+              <w:spacing w:before="0" w:after="0" w:line="240" w:lineRule="auto"/>
+              <w:jc w:val="left"/>
+            </w:pPr>
+            <w:r/>
+            <w:r>
+              <w:rPr>
+                <w:rFonts w:ascii="Times New Roman" w:hAnsi="Times New Roman" w:eastAsia="Times New Roman"/>
+                <w:b w:val="0"/>
+                <w:sz w:val="20"/>
+              </w:rPr>
+              <w:t>Completado</w:t>
+            </w:r>
+          </w:p>
+        </w:tc>
+        <w:tc>
+          <w:tcPr>
+            <w:tcW w:type="dxa" w:w="3600"/>
+            <w:vAlign w:val="center"/>
+          </w:tcPr>
+          <w:p>
+            <w:pPr>
+              <w:spacing w:before="0" w:after="0" w:line="240" w:lineRule="auto"/>
+              <w:jc w:val="left"/>
+            </w:pPr>
+            <w:r/>
+            <w:r>
+              <w:rPr>
+                <w:rFonts w:ascii="Times New Roman" w:hAnsi="Times New Roman" w:eastAsia="Times New Roman"/>
+                <w:b w:val="0"/>
+                <w:sz w:val="20"/>
+              </w:rPr>
+              <w:t>SSSD/PAM/LightDM validados.</w:t>
+            </w:r>
+          </w:p>
+        </w:tc>
+      </w:tr>
+      <w:tr>
+        <w:tc>
+          <w:tcPr>
+            <w:tcW w:type="dxa" w:w="3384"/>
+            <w:vAlign w:val="center"/>
+          </w:tcPr>
+          <w:p>
+            <w:pPr>
+              <w:spacing w:before="0" w:after="0" w:line="240" w:lineRule="auto"/>
+              <w:jc w:val="left"/>
+            </w:pPr>
+            <w:r/>
+            <w:r>
+              <w:rPr>
+                <w:rFonts w:ascii="Times New Roman" w:hAnsi="Times New Roman" w:eastAsia="Times New Roman"/>
+                <w:b w:val="0"/>
+                <w:sz w:val="20"/>
+              </w:rPr>
+              <w:t>cliente2 unido al dominio</w:t>
+            </w:r>
+          </w:p>
+        </w:tc>
+        <w:tc>
+          <w:tcPr>
+            <w:tcW w:type="dxa" w:w="1656"/>
+            <w:vAlign w:val="center"/>
+          </w:tcPr>
+          <w:p>
+            <w:pPr>
+              <w:spacing w:before="0" w:after="0" w:line="240" w:lineRule="auto"/>
+              <w:jc w:val="left"/>
+            </w:pPr>
+            <w:r/>
+            <w:r>
+              <w:rPr>
+                <w:rFonts w:ascii="Times New Roman" w:hAnsi="Times New Roman" w:eastAsia="Times New Roman"/>
+                <w:b w:val="0"/>
+                <w:sz w:val="20"/>
+              </w:rPr>
+              <w:t>Completado</w:t>
+            </w:r>
+          </w:p>
+        </w:tc>
+        <w:tc>
+          <w:tcPr>
+            <w:tcW w:type="dxa" w:w="3600"/>
+            <w:vAlign w:val="center"/>
+          </w:tcPr>
+          <w:p>
+            <w:pPr>
+              <w:spacing w:before="0" w:after="0" w:line="240" w:lineRule="auto"/>
+              <w:jc w:val="left"/>
+            </w:pPr>
+            <w:r/>
+            <w:r>
+              <w:rPr>
+                <w:rFonts w:ascii="Times New Roman" w:hAnsi="Times New Roman" w:eastAsia="Times New Roman"/>
+                <w:b w:val="0"/>
+                <w:sz w:val="20"/>
+              </w:rPr>
+              <w:t>Cuenta de equipo independiente y autenticación validada.</w:t>
+            </w:r>
+          </w:p>
+        </w:tc>
+      </w:tr>
+      <w:tr>
+        <w:tc>
+          <w:tcPr>
+            <w:tcW w:type="dxa" w:w="3384"/>
+            <w:vAlign w:val="center"/>
+          </w:tcPr>
+          <w:p>
+            <w:pPr>
+              <w:spacing w:before="0" w:after="0" w:line="240" w:lineRule="auto"/>
+              <w:jc w:val="left"/>
+            </w:pPr>
+            <w:r/>
+            <w:r>
+              <w:rPr>
+                <w:rFonts w:ascii="Times New Roman" w:hAnsi="Times New Roman" w:eastAsia="Times New Roman"/>
+                <w:b w:val="0"/>
+                <w:sz w:val="20"/>
+              </w:rPr>
+              <w:t>usuario1</w:t>
+            </w:r>
+          </w:p>
+        </w:tc>
+        <w:tc>
+          <w:tcPr>
+            <w:tcW w:type="dxa" w:w="1656"/>
+            <w:vAlign w:val="center"/>
+          </w:tcPr>
+          <w:p>
+            <w:pPr>
+              <w:spacing w:before="0" w:after="0" w:line="240" w:lineRule="auto"/>
+              <w:jc w:val="left"/>
+            </w:pPr>
+            <w:r/>
+            <w:r>
+              <w:rPr>
+                <w:rFonts w:ascii="Times New Roman" w:hAnsi="Times New Roman" w:eastAsia="Times New Roman"/>
+                <w:b w:val="0"/>
+                <w:sz w:val="20"/>
+              </w:rPr>
+              <w:t>Completado</w:t>
+            </w:r>
+          </w:p>
+        </w:tc>
+        <w:tc>
+          <w:tcPr>
+            <w:tcW w:type="dxa" w:w="3600"/>
+            <w:vAlign w:val="center"/>
+          </w:tcPr>
+          <w:p>
+            <w:pPr>
+              <w:spacing w:before="0" w:after="0" w:line="240" w:lineRule="auto"/>
+              <w:jc w:val="left"/>
+            </w:pPr>
+            <w:r/>
+            <w:r>
+              <w:rPr>
+                <w:rFonts w:ascii="Times New Roman" w:hAnsi="Times New Roman" w:eastAsia="Times New Roman"/>
+                <w:b w:val="0"/>
+                <w:sz w:val="20"/>
+              </w:rPr>
+              <w:t>Cuenta de prueba del dominio.</w:t>
+            </w:r>
+          </w:p>
+        </w:tc>
+      </w:tr>
+      <w:tr>
+        <w:tc>
+          <w:tcPr>
+            <w:tcW w:type="dxa" w:w="3384"/>
+            <w:vAlign w:val="center"/>
+          </w:tcPr>
+          <w:p>
+            <w:pPr>
+              <w:spacing w:before="0" w:after="0" w:line="240" w:lineRule="auto"/>
+              <w:jc w:val="left"/>
+            </w:pPr>
+            <w:r/>
+            <w:r>
+              <w:rPr>
+                <w:rFonts w:ascii="Times New Roman" w:hAnsi="Times New Roman" w:eastAsia="Times New Roman"/>
+                <w:b w:val="0"/>
+                <w:sz w:val="20"/>
+              </w:rPr>
+              <w:t>usuario2</w:t>
+            </w:r>
+          </w:p>
+        </w:tc>
+        <w:tc>
+          <w:tcPr>
+            <w:tcW w:type="dxa" w:w="1656"/>
+            <w:vAlign w:val="center"/>
+          </w:tcPr>
+          <w:p>
+            <w:pPr>
+              <w:spacing w:before="0" w:after="0" w:line="240" w:lineRule="auto"/>
+              <w:jc w:val="left"/>
+            </w:pPr>
+            <w:r/>
+            <w:r>
+              <w:rPr>
+                <w:rFonts w:ascii="Times New Roman" w:hAnsi="Times New Roman" w:eastAsia="Times New Roman"/>
+                <w:b w:val="0"/>
+                <w:sz w:val="20"/>
+              </w:rPr>
+              <w:t>Completado</w:t>
+            </w:r>
+          </w:p>
+        </w:tc>
+        <w:tc>
+          <w:tcPr>
+            <w:tcW w:type="dxa" w:w="3600"/>
+            <w:vAlign w:val="center"/>
+          </w:tcPr>
+          <w:p>
+            <w:pPr>
+              <w:spacing w:before="0" w:after="0" w:line="240" w:lineRule="auto"/>
+              <w:jc w:val="left"/>
+            </w:pPr>
+            <w:r/>
+            <w:r>
+              <w:rPr>
+                <w:rFonts w:ascii="Times New Roman" w:hAnsi="Times New Roman" w:eastAsia="Times New Roman"/>
+                <w:b w:val="0"/>
+                <w:sz w:val="20"/>
+              </w:rPr>
+              <w:t>Creado y probado en cliente2.</w:t>
+            </w:r>
+          </w:p>
+        </w:tc>
+      </w:tr>
+      <w:tr>
+        <w:tc>
+          <w:tcPr>
+            <w:tcW w:type="dxa" w:w="3384"/>
+            <w:vAlign w:val="center"/>
+          </w:tcPr>
+          <w:p>
+            <w:pPr>
+              <w:spacing w:before="0" w:after="0" w:line="240" w:lineRule="auto"/>
+              <w:jc w:val="left"/>
+            </w:pPr>
+            <w:r/>
+            <w:r>
+              <w:rPr>
+                <w:rFonts w:ascii="Times New Roman" w:hAnsi="Times New Roman" w:eastAsia="Times New Roman"/>
+                <w:b w:val="0"/>
+                <w:sz w:val="20"/>
+              </w:rPr>
+              <w:t>DHCP IPv4</w:t>
+            </w:r>
+          </w:p>
+        </w:tc>
+        <w:tc>
+          <w:tcPr>
+            <w:tcW w:type="dxa" w:w="1656"/>
+            <w:vAlign w:val="center"/>
+          </w:tcPr>
+          <w:p>
+            <w:pPr>
+              <w:spacing w:before="0" w:after="0" w:line="240" w:lineRule="auto"/>
+              <w:jc w:val="left"/>
+            </w:pPr>
+            <w:r/>
+            <w:r>
+              <w:rPr>
+                <w:rFonts w:ascii="Times New Roman" w:hAnsi="Times New Roman" w:eastAsia="Times New Roman"/>
+                <w:b w:val="0"/>
+                <w:sz w:val="20"/>
+              </w:rPr>
+              <w:t>En implementación</w:t>
+            </w:r>
+          </w:p>
+        </w:tc>
+        <w:tc>
+          <w:tcPr>
+            <w:tcW w:type="dxa" w:w="3600"/>
+            <w:vAlign w:val="center"/>
+          </w:tcPr>
+          <w:p>
+            <w:pPr>
+              <w:spacing w:before="0" w:after="0" w:line="240" w:lineRule="auto"/>
+              <w:jc w:val="left"/>
+            </w:pPr>
+            <w:r/>
+            <w:r>
+              <w:rPr>
+                <w:rFonts w:ascii="Times New Roman" w:hAnsi="Times New Roman" w:eastAsia="Times New Roman"/>
+                <w:b w:val="0"/>
+                <w:sz w:val="20"/>
+              </w:rPr>
+              <w:t>Servidor instalado; falta configuración final, relay y prueba de concesiones.</w:t>
+            </w:r>
+          </w:p>
+        </w:tc>
+      </w:tr>
+      <w:tr>
+        <w:tc>
+          <w:tcPr>
+            <w:tcW w:type="dxa" w:w="3384"/>
+            <w:vAlign w:val="center"/>
+          </w:tcPr>
+          <w:p>
+            <w:pPr>
+              <w:spacing w:before="0" w:after="0" w:line="240" w:lineRule="auto"/>
+              <w:jc w:val="left"/>
+            </w:pPr>
+            <w:r/>
+            <w:r>
+              <w:rPr>
+                <w:rFonts w:ascii="Times New Roman" w:hAnsi="Times New Roman" w:eastAsia="Times New Roman"/>
+                <w:b w:val="0"/>
+                <w:sz w:val="20"/>
+              </w:rPr>
+              <w:t>FTP seguro con TLS</w:t>
+            </w:r>
+          </w:p>
+        </w:tc>
+        <w:tc>
+          <w:tcPr>
+            <w:tcW w:type="dxa" w:w="1656"/>
+            <w:vAlign w:val="center"/>
+          </w:tcPr>
+          <w:p>
+            <w:pPr>
+              <w:spacing w:before="0" w:after="0" w:line="240" w:lineRule="auto"/>
+              <w:jc w:val="left"/>
+            </w:pPr>
+            <w:r/>
+            <w:r>
+              <w:rPr>
+                <w:rFonts w:ascii="Times New Roman" w:hAnsi="Times New Roman" w:eastAsia="Times New Roman"/>
+                <w:b w:val="0"/>
+                <w:sz w:val="20"/>
+              </w:rPr>
+              <w:t>Pendiente</w:t>
+            </w:r>
+          </w:p>
+        </w:tc>
+        <w:tc>
+          <w:tcPr>
+            <w:tcW w:type="dxa" w:w="3600"/>
+            <w:vAlign w:val="center"/>
+          </w:tcPr>
+          <w:p>
+            <w:pPr>
+              <w:spacing w:before="0" w:after="0" w:line="240" w:lineRule="auto"/>
+              <w:jc w:val="left"/>
+            </w:pPr>
+            <w:r/>
+            <w:r>
+              <w:rPr>
+                <w:rFonts w:ascii="Times New Roman" w:hAnsi="Times New Roman" w:eastAsia="Times New Roman"/>
+                <w:b w:val="0"/>
+                <w:sz w:val="20"/>
+              </w:rPr>
+              <w:t>Se realizará después de DHCP.</w:t>
+            </w:r>
+          </w:p>
+        </w:tc>
+      </w:tr>
+      <w:tr>
+        <w:tc>
+          <w:tcPr>
+            <w:tcW w:type="dxa" w:w="3384"/>
+            <w:vAlign w:val="center"/>
+          </w:tcPr>
+          <w:p>
+            <w:pPr>
+              <w:spacing w:before="0" w:after="0" w:line="240" w:lineRule="auto"/>
+              <w:jc w:val="left"/>
+            </w:pPr>
+            <w:r/>
+            <w:r>
+              <w:rPr>
+                <w:rFonts w:ascii="Times New Roman" w:hAnsi="Times New Roman" w:eastAsia="Times New Roman"/>
+                <w:b w:val="0"/>
+                <w:sz w:val="20"/>
+              </w:rPr>
+              <w:t>Correo SMTP + IMAP/POP3</w:t>
+            </w:r>
+          </w:p>
+        </w:tc>
+        <w:tc>
+          <w:tcPr>
+            <w:tcW w:type="dxa" w:w="1656"/>
+            <w:vAlign w:val="center"/>
+          </w:tcPr>
+          <w:p>
+            <w:pPr>
+              <w:spacing w:before="0" w:after="0" w:line="240" w:lineRule="auto"/>
+              <w:jc w:val="left"/>
+            </w:pPr>
+            <w:r/>
+            <w:r>
+              <w:rPr>
+                <w:rFonts w:ascii="Times New Roman" w:hAnsi="Times New Roman" w:eastAsia="Times New Roman"/>
+                <w:b w:val="0"/>
+                <w:sz w:val="20"/>
+              </w:rPr>
+              <w:t>Pendiente</w:t>
+            </w:r>
+          </w:p>
+        </w:tc>
+        <w:tc>
+          <w:tcPr>
+            <w:tcW w:type="dxa" w:w="3600"/>
+            <w:vAlign w:val="center"/>
+          </w:tcPr>
+          <w:p>
+            <w:pPr>
+              <w:spacing w:before="0" w:after="0" w:line="240" w:lineRule="auto"/>
+              <w:jc w:val="left"/>
+            </w:pPr>
+            <w:r/>
+            <w:r>
+              <w:rPr>
+                <w:rFonts w:ascii="Times New Roman" w:hAnsi="Times New Roman" w:eastAsia="Times New Roman"/>
+                <w:b w:val="0"/>
+                <w:sz w:val="20"/>
+              </w:rPr>
+              <w:t>Se realizará en la fase posterior.</w:t>
+            </w:r>
+          </w:p>
+        </w:tc>
+      </w:tr>
+    </w:tbl>
+    <w:p>
+      <w:pPr>
+        <w:spacing w:after="40"/>
+      </w:pPr>
+    </w:p>
+    <w:p>
+      <w:pPr>
+        <w:keepNext/>
+        <w:spacing w:line="480" w:lineRule="auto" w:before="160" w:after="80"/>
+        <w:ind w:firstLine="0"/>
+        <w:jc w:val="left"/>
+      </w:pPr>
+      <w:r>
+        <w:rPr>
+          <w:rFonts w:ascii="Times New Roman" w:hAnsi="Times New Roman" w:eastAsia="Times New Roman"/>
+          <w:b/>
+          <w:sz w:val="24"/>
+        </w:rPr>
+        <w:t>10. Próximos pasos</w:t>
+      </w:r>
+    </w:p>
+    <w:p>
+      <w:pPr>
+        <w:spacing w:line="480" w:lineRule="auto" w:before="0" w:after="0"/>
+        <w:ind w:firstLine="720"/>
+        <w:jc w:val="left"/>
+      </w:pPr>
+      <w:r>
+        <w:rPr>
+          <w:rFonts w:ascii="Times New Roman" w:hAnsi="Times New Roman" w:eastAsia="Times New Roman"/>
+          <w:sz w:val="24"/>
+        </w:rPr>
+        <w:t>Para completar la entrega semanal se continuará con la configuración final de DHCP en dc1 y el relay en R1. Una vez que cliente1 y cliente2 reciban correctamente sus reservas por DHCP, se tomarán capturas de evidencia de las concesiones, parámetros de red y conectividad. Posteriormente se incorporarán esas evidencias a este mismo documento y el estado de DHCP se actualizará de “En implementación” a “Completado”.</w:t>
+      </w:r>
+    </w:p>
+    <w:p>
+      <w:pPr>
+        <w:spacing w:line="480" w:lineRule="auto" w:before="0" w:after="0"/>
+        <w:ind w:firstLine="720"/>
+        <w:jc w:val="left"/>
+      </w:pPr>
+      <w:r>
+        <w:rPr>
+          <w:rFonts w:ascii="Times New Roman" w:hAnsi="Times New Roman" w:eastAsia="Times New Roman"/>
+          <w:sz w:val="24"/>
+        </w:rPr>
+        <w:t>Después de la entrega de DHCP, el proyecto continuará con FTP seguro mediante TLS, autenticación sin acceso anónimo, correo electrónico mediante SMTP con IMAP y/o POP3, pruebas integrales desde los clientes y consolidación de la documentación final.</w:t>
+      </w:r>
+    </w:p>
+    <w:p>
+      <w:pPr>
+        <w:keepNext/>
+        <w:spacing w:line="480" w:lineRule="auto" w:before="160" w:after="80"/>
+        <w:ind w:firstLine="0"/>
+        <w:jc w:val="left"/>
+      </w:pPr>
+      <w:r>
+        <w:rPr>
+          <w:rFonts w:ascii="Times New Roman" w:hAnsi="Times New Roman" w:eastAsia="Times New Roman"/>
+          <w:b/>
+          <w:sz w:val="24"/>
+        </w:rPr>
+        <w:t>Apéndice A. Comandos de verificación utilizados</w:t>
+      </w:r>
+    </w:p>
+    <w:p>
+      <w:pPr>
+        <w:spacing w:before="80" w:after="80" w:line="240" w:lineRule="auto"/>
+        <w:ind w:left="432" w:right="432"/>
+        <w:shd w:fill="F2F2F2"/>
+      </w:pPr>
+      <w:r>
+        <w:rPr>
+          <w:rFonts w:ascii="Consolas" w:hAnsi="Consolas" w:eastAsia="Consolas"/>
+          <w:sz w:val="18"/>
+        </w:rPr>
+        <w:t>Servidor dc1:</w:t>
+        <w:br/>
+        <w:t xml:space="preserve"> hostname -f</w:t>
+        <w:br/>
+        <w:t xml:space="preserve"> systemctl status samba-ad-dc --no-pager</w:t>
+        <w:br/>
+        <w:t xml:space="preserve"> samba-tool user list</w:t>
+        <w:br/>
+        <w:t xml:space="preserve"> samba-tool user show usuario2</w:t>
+        <w:br/>
+        <w:t xml:space="preserve"> host dc1.redesi.test</w:t>
+        <w:br/>
+        <w:t xml:space="preserve"> host -t SRV _ldap._tcp.redesi.test</w:t>
+        <w:br/>
+        <w:t xml:space="preserve"> host -t SRV _kerberos._udp.redesi.test</w:t>
+        <w:br/>
+        <w:br/>
+        <w:t>Clientes:</w:t>
+        <w:br/>
+        <w:t xml:space="preserve"> realm list</w:t>
+        <w:br/>
+        <w:t xml:space="preserve"> id usuario1</w:t>
+        <w:br/>
+        <w:t xml:space="preserve"> id usuario2</w:t>
+        <w:br/>
+        <w:t xml:space="preserve"> whoami</w:t>
+        <w:br/>
+        <w:t xml:space="preserve"> hostname -f</w:t>
+        <w:br/>
+        <w:t xml:space="preserve"> kinit usuario1   # o usuario2</w:t>
+        <w:br/>
+        <w:t xml:space="preserve"> klist</w:t>
+        <w:br/>
+        <w:br/>
+        <w:t>R1:</w:t>
+        <w:br/>
+        <w:t xml:space="preserve"> show ip route 192.168.3.2</w:t>
+        <w:br/>
+        <w:t xml:space="preserve"> show ip nat translations</w:t>
+        <w:br/>
+        <w:t xml:space="preserve"> telnet 192.168.3.2 22</w:t>
+      </w:r>
+    </w:p>
     <w:sectPr>
       <w:type w:val="nextPage"/>
       <w:pgSz w:h="15840" w:w="12240" w:orient="portrait"/>
-      <w:pgMar w:bottom="1440.0000000000002" w:top="1440.0000000000002" w:left="1440.0000000000002" w:right="1440.0000000000002" w:header="720" w:footer="720"/>
+      <w:pgMar w:bottom="1440" w:top="1440" w:left="1440" w:right="1440" w:header="720" w:footer="720"/>
     </w:sectPr>
   </w:body>
 </w:document>

</xml_diff>

<commit_message>
Actualizar documentación con usuarios y contraseñas del laboratorio
</commit_message>
<xml_diff>
--- a/Documentación_Proyecto Redes I.docx
+++ b/Documentación_Proyecto Redes I.docx
@@ -4282,19 +4282,18 @@
       <w:pPr>
         <w:shd w:val="clear" w:color="auto" w:fill="F2F2F2"/>
         <w:spacing w:before="80" w:after="80" w:line="240" w:lineRule="auto"/>
-        <w:ind w:left="432" w:right="432"/>
+        <w:ind w:left="431" w:right="431" w:firstLine="0"/>
+        <w:jc w:val="left"/>
       </w:pPr>
       <w:r>
         <w:rPr>
-          <w:rFonts w:ascii="Consolas" w:eastAsia="Consolas" w:hAnsi="Consolas"/>
-          <w:sz w:val="18"/>
+          <w:rFonts w:eastAsia="Consolas"/>
         </w:rPr>
         <w:t>R1:</w:t>
       </w:r>
       <w:r>
         <w:rPr>
-          <w:rFonts w:ascii="Consolas" w:eastAsia="Consolas" w:hAnsi="Consolas"/>
-          <w:sz w:val="18"/>
+          <w:rFonts w:eastAsia="Consolas"/>
         </w:rPr>
         <w:br/>
         <w:t xml:space="preserve"> </w:t>
@@ -4302,39 +4301,34 @@
       <w:proofErr w:type="spellStart"/>
       <w:r>
         <w:rPr>
-          <w:rFonts w:ascii="Consolas" w:eastAsia="Consolas" w:hAnsi="Consolas"/>
-          <w:sz w:val="18"/>
+          <w:rFonts w:eastAsia="Consolas"/>
         </w:rPr>
         <w:t>ip</w:t>
       </w:r>
       <w:proofErr w:type="spellEnd"/>
       <w:r>
         <w:rPr>
-          <w:rFonts w:ascii="Consolas" w:eastAsia="Consolas" w:hAnsi="Consolas"/>
-          <w:sz w:val="18"/>
+          <w:rFonts w:eastAsia="Consolas"/>
         </w:rPr>
         <w:t xml:space="preserve"> </w:t>
       </w:r>
       <w:proofErr w:type="spellStart"/>
       <w:r>
         <w:rPr>
-          <w:rFonts w:ascii="Consolas" w:eastAsia="Consolas" w:hAnsi="Consolas"/>
-          <w:sz w:val="18"/>
+          <w:rFonts w:eastAsia="Consolas"/>
         </w:rPr>
         <w:t>route</w:t>
       </w:r>
       <w:proofErr w:type="spellEnd"/>
       <w:r>
         <w:rPr>
-          <w:rFonts w:ascii="Consolas" w:eastAsia="Consolas" w:hAnsi="Consolas"/>
-          <w:sz w:val="18"/>
+          <w:rFonts w:eastAsia="Consolas"/>
         </w:rPr>
         <w:t xml:space="preserve"> 192.168.3.0 255.255.255.0 192.168.2.2</w:t>
       </w:r>
       <w:r>
         <w:rPr>
-          <w:rFonts w:ascii="Consolas" w:eastAsia="Consolas" w:hAnsi="Consolas"/>
-          <w:sz w:val="18"/>
+          <w:rFonts w:eastAsia="Consolas"/>
         </w:rPr>
         <w:br/>
         <w:t xml:space="preserve"> </w:t>
@@ -4342,54 +4336,47 @@
       <w:proofErr w:type="spellStart"/>
       <w:r>
         <w:rPr>
-          <w:rFonts w:ascii="Consolas" w:eastAsia="Consolas" w:hAnsi="Consolas"/>
-          <w:sz w:val="18"/>
+          <w:rFonts w:eastAsia="Consolas"/>
         </w:rPr>
         <w:t>ip</w:t>
       </w:r>
       <w:proofErr w:type="spellEnd"/>
       <w:r>
         <w:rPr>
-          <w:rFonts w:ascii="Consolas" w:eastAsia="Consolas" w:hAnsi="Consolas"/>
-          <w:sz w:val="18"/>
+          <w:rFonts w:eastAsia="Consolas"/>
         </w:rPr>
         <w:t xml:space="preserve"> </w:t>
       </w:r>
       <w:proofErr w:type="spellStart"/>
       <w:r>
         <w:rPr>
-          <w:rFonts w:ascii="Consolas" w:eastAsia="Consolas" w:hAnsi="Consolas"/>
-          <w:sz w:val="18"/>
+          <w:rFonts w:eastAsia="Consolas"/>
         </w:rPr>
         <w:t>route</w:t>
       </w:r>
       <w:proofErr w:type="spellEnd"/>
       <w:r>
         <w:rPr>
-          <w:rFonts w:ascii="Consolas" w:eastAsia="Consolas" w:hAnsi="Consolas"/>
-          <w:sz w:val="18"/>
+          <w:rFonts w:eastAsia="Consolas"/>
         </w:rPr>
         <w:t xml:space="preserve"> 0.0.0.0 0.0.0.0 192.168.122.1</w:t>
       </w:r>
       <w:r>
         <w:rPr>
-          <w:rFonts w:ascii="Consolas" w:eastAsia="Consolas" w:hAnsi="Consolas"/>
-          <w:sz w:val="18"/>
+          <w:rFonts w:eastAsia="Consolas"/>
         </w:rPr>
         <w:br/>
       </w:r>
       <w:r>
         <w:rPr>
-          <w:rFonts w:ascii="Consolas" w:eastAsia="Consolas" w:hAnsi="Consolas"/>
-          <w:sz w:val="18"/>
+          <w:rFonts w:eastAsia="Consolas"/>
         </w:rPr>
         <w:br/>
         <w:t>R2:</w:t>
       </w:r>
       <w:r>
         <w:rPr>
-          <w:rFonts w:ascii="Consolas" w:eastAsia="Consolas" w:hAnsi="Consolas"/>
-          <w:sz w:val="18"/>
+          <w:rFonts w:eastAsia="Consolas"/>
         </w:rPr>
         <w:br/>
         <w:t xml:space="preserve"> </w:t>
@@ -4397,39 +4384,34 @@
       <w:proofErr w:type="spellStart"/>
       <w:r>
         <w:rPr>
-          <w:rFonts w:ascii="Consolas" w:eastAsia="Consolas" w:hAnsi="Consolas"/>
-          <w:sz w:val="18"/>
+          <w:rFonts w:eastAsia="Consolas"/>
         </w:rPr>
         <w:t>ip</w:t>
       </w:r>
       <w:proofErr w:type="spellEnd"/>
       <w:r>
         <w:rPr>
-          <w:rFonts w:ascii="Consolas" w:eastAsia="Consolas" w:hAnsi="Consolas"/>
-          <w:sz w:val="18"/>
+          <w:rFonts w:eastAsia="Consolas"/>
         </w:rPr>
         <w:t xml:space="preserve"> </w:t>
       </w:r>
       <w:proofErr w:type="spellStart"/>
       <w:r>
         <w:rPr>
-          <w:rFonts w:ascii="Consolas" w:eastAsia="Consolas" w:hAnsi="Consolas"/>
-          <w:sz w:val="18"/>
+          <w:rFonts w:eastAsia="Consolas"/>
         </w:rPr>
         <w:t>route</w:t>
       </w:r>
       <w:proofErr w:type="spellEnd"/>
       <w:r>
         <w:rPr>
-          <w:rFonts w:ascii="Consolas" w:eastAsia="Consolas" w:hAnsi="Consolas"/>
-          <w:sz w:val="18"/>
+          <w:rFonts w:eastAsia="Consolas"/>
         </w:rPr>
         <w:t xml:space="preserve"> 192.168.1.0 255.255.255.0 192.168.2.1</w:t>
       </w:r>
       <w:r>
         <w:rPr>
-          <w:rFonts w:ascii="Consolas" w:eastAsia="Consolas" w:hAnsi="Consolas"/>
-          <w:sz w:val="18"/>
+          <w:rFonts w:eastAsia="Consolas"/>
         </w:rPr>
         <w:br/>
         <w:t xml:space="preserve"> </w:t>
@@ -4437,32 +4419,28 @@
       <w:proofErr w:type="spellStart"/>
       <w:r>
         <w:rPr>
-          <w:rFonts w:ascii="Consolas" w:eastAsia="Consolas" w:hAnsi="Consolas"/>
-          <w:sz w:val="18"/>
+          <w:rFonts w:eastAsia="Consolas"/>
         </w:rPr>
         <w:t>ip</w:t>
       </w:r>
       <w:proofErr w:type="spellEnd"/>
       <w:r>
         <w:rPr>
-          <w:rFonts w:ascii="Consolas" w:eastAsia="Consolas" w:hAnsi="Consolas"/>
-          <w:sz w:val="18"/>
+          <w:rFonts w:eastAsia="Consolas"/>
         </w:rPr>
         <w:t xml:space="preserve"> </w:t>
       </w:r>
       <w:proofErr w:type="spellStart"/>
       <w:r>
         <w:rPr>
-          <w:rFonts w:ascii="Consolas" w:eastAsia="Consolas" w:hAnsi="Consolas"/>
-          <w:sz w:val="18"/>
+          <w:rFonts w:eastAsia="Consolas"/>
         </w:rPr>
         <w:t>route</w:t>
       </w:r>
       <w:proofErr w:type="spellEnd"/>
       <w:r>
         <w:rPr>
-          <w:rFonts w:ascii="Consolas" w:eastAsia="Consolas" w:hAnsi="Consolas"/>
-          <w:sz w:val="18"/>
+          <w:rFonts w:eastAsia="Consolas"/>
         </w:rPr>
         <w:t xml:space="preserve"> 0.0.0.0 0.0.0.0 192.168.2.1</w:t>
       </w:r>
@@ -9388,6 +9366,7 @@
   <w:style w:type="character" w:default="1" w:styleId="Fuentedeprrafopredeter">
     <w:name w:val="Default Paragraph Font"/>
     <w:uiPriority w:val="1"/>
+    <w:semiHidden/>
     <w:unhideWhenUsed/>
   </w:style>
   <w:style w:type="table" w:default="1" w:styleId="Tablanormal">

</xml_diff>